<commit_message>
active state is added with its testbench and more
</commit_message>
<xml_diff>
--- a/docs/SM/RDI_SM/SM.docx
+++ b/docs/SM/RDI_SM/SM.docx
@@ -1,6 +1,6 @@
 
 <file path=word/document.xml><?xml version="1.0" encoding="utf-8"?>
-<w:document xmlns:o="urn:schemas-microsoft-com:office:office" xmlns:r="http://schemas.openxmlformats.org/officeDocument/2006/relationships" xmlns:v="urn:schemas-microsoft-com:vml" xmlns:w="http://schemas.openxmlformats.org/wordprocessingml/2006/main" xmlns:w10="urn:schemas-microsoft-com:office:word" xmlns:wp="http://schemas.openxmlformats.org/drawingml/2006/wordprocessingDrawing" xmlns:wps="http://schemas.microsoft.com/office/word/2010/wordprocessingShape" xmlns:wpg="http://schemas.microsoft.com/office/word/2010/wordprocessingGroup" xmlns:mc="http://schemas.openxmlformats.org/markup-compatibility/2006" xmlns:wp14="http://schemas.microsoft.com/office/word/2010/wordprocessingDrawing" xmlns:w14="http://schemas.microsoft.com/office/word/2010/wordml" xmlns:w15="http://schemas.microsoft.com/office/word/2012/wordml" mc:Ignorable="w14 wp14 w15">
+<w:document xmlns:o="urn:schemas-microsoft-com:office:office" xmlns:r="http://schemas.openxmlformats.org/officeDocument/2006/relationships" xmlns:v="urn:schemas-microsoft-com:vml" xmlns:w="http://schemas.openxmlformats.org/wordprocessingml/2006/main" xmlns:w10="urn:schemas-microsoft-com:office:word" xmlns:wp="http://schemas.openxmlformats.org/drawingml/2006/wordprocessingDrawing" xmlns:pic="http://schemas.openxmlformats.org/drawingml/2006/picture" xmlns:wps="http://schemas.microsoft.com/office/word/2010/wordprocessingShape" xmlns:wpg="http://schemas.microsoft.com/office/word/2010/wordprocessingGroup" xmlns:mc="http://schemas.openxmlformats.org/markup-compatibility/2006" xmlns:wp14="http://schemas.microsoft.com/office/word/2010/wordprocessingDrawing" xmlns:w14="http://schemas.microsoft.com/office/word/2010/wordml" xmlns:w15="http://schemas.microsoft.com/office/word/2012/wordml" mc:Ignorable="w14 wp14 w15">
   <w:body>
     <w:p>
       <w:pPr>
@@ -10,7 +10,6 @@
           <w:rFonts w:ascii="Arial;sans-serif" w:hAnsi="Arial;sans-serif"/>
           <w:b/>
           <w:bCs/>
-          <w:i w:val="false"/>
           <w:i w:val="false"/>
           <w:caps w:val="false"/>
           <w:smallCaps w:val="false"/>
@@ -88,7 +87,6 @@
           <w:b w:val="false"/>
           <w:bCs w:val="false"/>
           <w:i w:val="false"/>
-          <w:i w:val="false"/>
           <w:caps w:val="false"/>
           <w:smallCaps w:val="false"/>
           <w:strike w:val="false"/>
@@ -172,7 +170,7 @@
           <w:szCs w:val="26"/>
         </w:rPr>
         <w:drawing>
-          <wp:anchor behindDoc="0" distT="0" distB="0" distL="0" distR="0" simplePos="0" locked="0" layoutInCell="0" allowOverlap="1" relativeHeight="7">
+          <wp:anchor distT="0" distB="0" distL="0" distR="0" simplePos="0" relativeHeight="7" behindDoc="0" locked="0" layoutInCell="0" allowOverlap="1">
             <wp:simplePos x="0" y="0"/>
             <wp:positionH relativeFrom="column">
               <wp:posOffset>-342265</wp:posOffset>
@@ -183,7 +181,7 @@
             <wp:extent cx="7740650" cy="5873115"/>
             <wp:effectExtent l="0" t="0" r="0" b="0"/>
             <wp:wrapSquare wrapText="largest"/>
-            <wp:docPr id="1" name="Image2" descr=""/>
+            <wp:docPr id="1" name="Image2"/>
             <wp:cNvGraphicFramePr>
               <a:graphicFrameLocks xmlns:a="http://schemas.openxmlformats.org/drawingml/2006/main" noChangeAspect="1"/>
             </wp:cNvGraphicFramePr>
@@ -191,7 +189,7 @@
               <a:graphicData uri="http://schemas.openxmlformats.org/drawingml/2006/picture">
                 <pic:pic xmlns:pic="http://schemas.openxmlformats.org/drawingml/2006/picture">
                   <pic:nvPicPr>
-                    <pic:cNvPr id="1" name="Image2" descr=""/>
+                    <pic:cNvPr id="1" name="Image2"/>
                     <pic:cNvPicPr>
                       <a:picLocks noChangeAspect="1" noChangeArrowheads="1"/>
                     </pic:cNvPicPr>
@@ -210,6 +208,7 @@
                     <a:prstGeom prst="rect">
                       <a:avLst/>
                     </a:prstGeom>
+                    <a:noFill/>
                   </pic:spPr>
                 </pic:pic>
               </a:graphicData>
@@ -228,7 +227,6 @@
           <w:rFonts w:ascii="Arial;sans-serif" w:hAnsi="Arial;sans-serif"/>
           <w:b/>
           <w:bCs/>
-          <w:i w:val="false"/>
           <w:i w:val="false"/>
           <w:caps w:val="false"/>
           <w:smallCaps w:val="false"/>
@@ -844,7 +842,6 @@
           <w:b/>
           <w:bCs/>
           <w:i w:val="false"/>
-          <w:i w:val="false"/>
           <w:caps w:val="false"/>
           <w:smallCaps w:val="false"/>
           <w:strike w:val="false"/>
@@ -888,7 +885,6 @@
           <w:b w:val="false"/>
           <w:bCs w:val="false"/>
           <w:i w:val="false"/>
-          <w:i w:val="false"/>
           <w:caps w:val="false"/>
           <w:smallCaps w:val="false"/>
           <w:strike w:val="false"/>
@@ -1187,7 +1183,6 @@
           <w:rFonts w:ascii="Arial;sans-serif" w:hAnsi="Arial;sans-serif"/>
           <w:b/>
           <w:bCs/>
-          <w:i w:val="false"/>
           <w:i w:val="false"/>
           <w:caps w:val="false"/>
           <w:smallCaps w:val="false"/>
@@ -1627,7 +1622,6 @@
           <w:b w:val="false"/>
           <w:bCs w:val="false"/>
           <w:i w:val="false"/>
-          <w:i w:val="false"/>
           <w:caps w:val="false"/>
           <w:smallCaps w:val="false"/>
           <w:color w:val="000000"/>
@@ -1695,7 +1689,7 @@
       </w:pPr>
       <w:r>
         <w:drawing>
-          <wp:anchor behindDoc="0" distT="0" distB="0" distL="0" distR="0" simplePos="0" locked="0" layoutInCell="0" allowOverlap="1" relativeHeight="3">
+          <wp:anchor distT="0" distB="0" distL="0" distR="0" simplePos="0" relativeHeight="3" behindDoc="0" locked="0" layoutInCell="0" allowOverlap="1">
             <wp:simplePos x="0" y="0"/>
             <wp:positionH relativeFrom="column">
               <wp:align>center</wp:align>
@@ -1706,7 +1700,7 @@
             <wp:extent cx="5184775" cy="2614295"/>
             <wp:effectExtent l="0" t="0" r="0" b="0"/>
             <wp:wrapSquare wrapText="largest"/>
-            <wp:docPr id="2" name="Image1" descr=""/>
+            <wp:docPr id="2" name="Image1"/>
             <wp:cNvGraphicFramePr>
               <a:graphicFrameLocks xmlns:a="http://schemas.openxmlformats.org/drawingml/2006/main" noChangeAspect="1"/>
             </wp:cNvGraphicFramePr>
@@ -1714,7 +1708,7 @@
               <a:graphicData uri="http://schemas.openxmlformats.org/drawingml/2006/picture">
                 <pic:pic xmlns:pic="http://schemas.openxmlformats.org/drawingml/2006/picture">
                   <pic:nvPicPr>
-                    <pic:cNvPr id="2" name="Image1" descr=""/>
+                    <pic:cNvPr id="2" name="Image1"/>
                     <pic:cNvPicPr>
                       <a:picLocks noChangeAspect="1" noChangeArrowheads="1"/>
                     </pic:cNvPicPr>
@@ -1733,6 +1727,7 @@
                     <a:prstGeom prst="rect">
                       <a:avLst/>
                     </a:prstGeom>
+                    <a:noFill/>
                   </pic:spPr>
                 </pic:pic>
               </a:graphicData>
@@ -1755,7 +1750,6 @@
           <w:rFonts w:ascii="Arial;sans-serif" w:hAnsi="Arial;sans-serif"/>
           <w:b w:val="false"/>
           <w:bCs w:val="false"/>
-          <w:i w:val="false"/>
           <w:i w:val="false"/>
           <w:caps w:val="false"/>
           <w:smallCaps w:val="false"/>
@@ -1806,7 +1800,7 @@
         <w:gridCol w:w="3177"/>
         <w:gridCol w:w="1255"/>
         <w:gridCol w:w="900"/>
-        <w:gridCol w:w="5222"/>
+        <w:gridCol w:w="5223"/>
       </w:tblGrid>
       <w:tr>
         <w:trPr/>
@@ -1830,7 +1824,6 @@
                 <w:rFonts w:ascii="Arial;sans-serif" w:hAnsi="Arial;sans-serif"/>
                 <w:b w:val="false"/>
                 <w:bCs w:val="false"/>
-                <w:i w:val="false"/>
                 <w:i w:val="false"/>
                 <w:caps w:val="false"/>
                 <w:smallCaps w:val="false"/>
@@ -1885,7 +1878,6 @@
                 <w:rFonts w:ascii="Arial;sans-serif" w:hAnsi="Arial;sans-serif"/>
                 <w:b w:val="false"/>
                 <w:bCs w:val="false"/>
-                <w:i w:val="false"/>
                 <w:i w:val="false"/>
                 <w:caps w:val="false"/>
                 <w:smallCaps w:val="false"/>
@@ -1943,7 +1935,6 @@
                 <w:b w:val="false"/>
                 <w:bCs w:val="false"/>
                 <w:i w:val="false"/>
-                <w:i w:val="false"/>
                 <w:caps w:val="false"/>
                 <w:smallCaps w:val="false"/>
                 <w:strike w:val="false"/>
@@ -1979,7 +1970,7 @@
         </w:tc>
         <w:tc>
           <w:tcPr>
-            <w:tcW w:w="5222" w:type="dxa"/>
+            <w:tcW w:w="5223" w:type="dxa"/>
             <w:tcBorders>
               <w:top w:val="single" w:sz="8" w:space="0" w:color="000000"/>
               <w:left w:val="single" w:sz="8" w:space="0" w:color="000000"/>
@@ -1998,7 +1989,6 @@
                 <w:rFonts w:ascii="Arial;sans-serif" w:hAnsi="Arial;sans-serif"/>
                 <w:b w:val="false"/>
                 <w:bCs w:val="false"/>
-                <w:i w:val="false"/>
                 <w:i w:val="false"/>
                 <w:caps w:val="false"/>
                 <w:smallCaps w:val="false"/>
@@ -2057,7 +2047,6 @@
                 <w:b w:val="false"/>
                 <w:bCs w:val="false"/>
                 <w:i w:val="false"/>
-                <w:i w:val="false"/>
                 <w:caps w:val="false"/>
                 <w:smallCaps w:val="false"/>
                 <w:strike w:val="false"/>
@@ -2111,7 +2100,6 @@
                 <w:rFonts w:ascii="Arial;sans-serif" w:hAnsi="Arial;sans-serif"/>
                 <w:b w:val="false"/>
                 <w:bCs w:val="false"/>
-                <w:i w:val="false"/>
                 <w:i w:val="false"/>
                 <w:caps w:val="false"/>
                 <w:smallCaps w:val="false"/>
@@ -2169,7 +2157,6 @@
                 <w:b w:val="false"/>
                 <w:bCs w:val="false"/>
                 <w:i w:val="false"/>
-                <w:i w:val="false"/>
                 <w:caps w:val="false"/>
                 <w:smallCaps w:val="false"/>
                 <w:strike w:val="false"/>
@@ -2205,7 +2192,7 @@
         </w:tc>
         <w:tc>
           <w:tcPr>
-            <w:tcW w:w="5222" w:type="dxa"/>
+            <w:tcW w:w="5223" w:type="dxa"/>
             <w:tcBorders>
               <w:top w:val="single" w:sz="8" w:space="0" w:color="000000"/>
               <w:left w:val="single" w:sz="8" w:space="0" w:color="000000"/>
@@ -2224,7 +2211,6 @@
                 <w:rFonts w:ascii="Arial;sans-serif" w:hAnsi="Arial;sans-serif"/>
                 <w:b w:val="false"/>
                 <w:bCs w:val="false"/>
-                <w:i w:val="false"/>
                 <w:i w:val="false"/>
                 <w:caps w:val="false"/>
                 <w:smallCaps w:val="false"/>
@@ -2283,7 +2269,6 @@
                 <w:b w:val="false"/>
                 <w:bCs w:val="false"/>
                 <w:i w:val="false"/>
-                <w:i w:val="false"/>
                 <w:caps w:val="false"/>
                 <w:smallCaps w:val="false"/>
                 <w:strike w:val="false"/>
@@ -2385,7 +2370,7 @@
         </w:tc>
         <w:tc>
           <w:tcPr>
-            <w:tcW w:w="5222" w:type="dxa"/>
+            <w:tcW w:w="5223" w:type="dxa"/>
             <w:tcBorders>
               <w:top w:val="single" w:sz="8" w:space="0" w:color="000000"/>
               <w:left w:val="single" w:sz="8" w:space="0" w:color="000000"/>
@@ -2439,7 +2424,6 @@
                 <w:b w:val="false"/>
                 <w:bCs w:val="false"/>
                 <w:i w:val="false"/>
-                <w:i w:val="false"/>
                 <w:caps w:val="false"/>
                 <w:smallCaps w:val="false"/>
                 <w:strike w:val="false"/>
@@ -2492,7 +2476,6 @@
                 <w:rFonts w:ascii="Arial;sans-serif" w:hAnsi="Arial;sans-serif"/>
                 <w:b w:val="false"/>
                 <w:bCs w:val="false"/>
-                <w:i w:val="false"/>
                 <w:i w:val="false"/>
                 <w:caps w:val="false"/>
                 <w:smallCaps w:val="false"/>
@@ -2549,7 +2532,6 @@
                 <w:b w:val="false"/>
                 <w:bCs w:val="false"/>
                 <w:i w:val="false"/>
-                <w:i w:val="false"/>
                 <w:caps w:val="false"/>
                 <w:smallCaps w:val="false"/>
                 <w:strike w:val="false"/>
@@ -2585,7 +2567,7 @@
         </w:tc>
         <w:tc>
           <w:tcPr>
-            <w:tcW w:w="5222" w:type="dxa"/>
+            <w:tcW w:w="5223" w:type="dxa"/>
             <w:tcBorders>
               <w:left w:val="single" w:sz="8" w:space="0" w:color="000000"/>
               <w:bottom w:val="single" w:sz="8" w:space="0" w:color="000000"/>
@@ -2734,7 +2716,7 @@
         </w:tc>
         <w:tc>
           <w:tcPr>
-            <w:tcW w:w="5222" w:type="dxa"/>
+            <w:tcW w:w="5223" w:type="dxa"/>
             <w:tcBorders>
               <w:left w:val="single" w:sz="8" w:space="0" w:color="000000"/>
               <w:bottom w:val="single" w:sz="8" w:space="0" w:color="000000"/>
@@ -2774,7 +2756,6 @@
           <w:b/>
           <w:bCs/>
           <w:i w:val="false"/>
-          <w:i w:val="false"/>
           <w:caps w:val="false"/>
           <w:smallCaps w:val="false"/>
           <w:strike w:val="false"/>
@@ -2884,7 +2865,6 @@
           <w:b w:val="false"/>
           <w:bCs w:val="false"/>
           <w:i w:val="false"/>
-          <w:i w:val="false"/>
           <w:caps w:val="false"/>
           <w:smallCaps w:val="false"/>
           <w:strike w:val="false"/>
@@ -2927,7 +2907,6 @@
           <w:rFonts w:ascii="Arial;sans-serif" w:hAnsi="Arial;sans-serif"/>
           <w:b w:val="false"/>
           <w:bCs w:val="false"/>
-          <w:i w:val="false"/>
           <w:i w:val="false"/>
           <w:caps w:val="false"/>
           <w:smallCaps w:val="false"/>
@@ -2980,7 +2959,6 @@
           <w:b w:val="false"/>
           <w:bCs w:val="false"/>
           <w:i w:val="false"/>
-          <w:i w:val="false"/>
           <w:caps w:val="false"/>
           <w:smallCaps w:val="false"/>
           <w:strike w:val="false"/>
@@ -3032,7 +3010,6 @@
           <w:b w:val="false"/>
           <w:bCs w:val="false"/>
           <w:i w:val="false"/>
-          <w:i w:val="false"/>
           <w:caps w:val="false"/>
           <w:smallCaps w:val="false"/>
           <w:strike w:val="false"/>
@@ -3122,7 +3099,6 @@
           <w:b/>
           <w:bCs/>
           <w:i w:val="false"/>
-          <w:i w:val="false"/>
           <w:caps w:val="false"/>
           <w:smallCaps w:val="false"/>
           <w:sz w:val="32"/>
@@ -3160,7 +3136,6 @@
           <w:b/>
           <w:bCs/>
           <w:i w:val="false"/>
-          <w:i w:val="false"/>
           <w:caps w:val="false"/>
           <w:smallCaps w:val="false"/>
           <w:sz w:val="32"/>
@@ -3218,7 +3193,6 @@
           <w:b w:val="false"/>
           <w:bCs w:val="false"/>
           <w:i w:val="false"/>
-          <w:i w:val="false"/>
           <w:caps w:val="false"/>
           <w:smallCaps w:val="false"/>
           <w:spacing w:val="0"/>
@@ -3266,7 +3240,6 @@
           <w:b w:val="false"/>
           <w:bCs w:val="false"/>
           <w:i w:val="false"/>
-          <w:i w:val="false"/>
           <w:caps w:val="false"/>
           <w:smallCaps w:val="false"/>
           <w:spacing w:val="0"/>
@@ -3300,7 +3273,6 @@
           <w:b w:val="false"/>
           <w:bCs w:val="false"/>
           <w:i w:val="false"/>
-          <w:i w:val="false"/>
           <w:caps w:val="false"/>
           <w:smallCaps w:val="false"/>
           <w:spacing w:val="0"/>
@@ -3335,7 +3307,6 @@
           <w:b w:val="false"/>
           <w:bCs w:val="false"/>
           <w:i w:val="false"/>
-          <w:i w:val="false"/>
           <w:caps w:val="false"/>
           <w:smallCaps w:val="false"/>
           <w:spacing w:val="0"/>
@@ -3375,7 +3346,6 @@
           <w:b w:val="false"/>
           <w:bCs w:val="false"/>
           <w:i w:val="false"/>
-          <w:i w:val="false"/>
           <w:caps w:val="false"/>
           <w:smallCaps w:val="false"/>
           <w:spacing w:val="0"/>
@@ -3418,7 +3388,6 @@
           <w:b w:val="false"/>
           <w:bCs w:val="false"/>
           <w:i w:val="false"/>
-          <w:i w:val="false"/>
           <w:caps w:val="false"/>
           <w:smallCaps w:val="false"/>
           <w:spacing w:val="0"/>
@@ -3450,7 +3419,6 @@
           <w:b w:val="false"/>
           <w:bCs w:val="false"/>
           <w:i w:val="false"/>
-          <w:i w:val="false"/>
           <w:caps w:val="false"/>
           <w:smallCaps w:val="false"/>
           <w:spacing w:val="0"/>
@@ -3482,7 +3450,6 @@
           <w:b w:val="false"/>
           <w:bCs w:val="false"/>
           <w:i w:val="false"/>
-          <w:i w:val="false"/>
           <w:caps w:val="false"/>
           <w:smallCaps w:val="false"/>
           <w:spacing w:val="0"/>
@@ -3772,7 +3739,6 @@
         <w:rPr>
           <w:rFonts w:ascii="rem;Google Sans Text;Google Sans;sans-serif" w:hAnsi="rem;Google Sans Text;Google Sans;sans-serif"/>
           <w:i w:val="false"/>
-          <w:i w:val="false"/>
         </w:rPr>
       </w:pPr>
       <w:r>
@@ -3789,7 +3755,6 @@
         <w:ind w:hanging="0" w:left="0" w:right="0"/>
         <w:rPr>
           <w:rFonts w:ascii="rem;Google Sans Text;Google Sans;sans-serif" w:hAnsi="rem;Google Sans Text;Google Sans;sans-serif"/>
-          <w:i w:val="false"/>
           <w:i w:val="false"/>
         </w:rPr>
       </w:pPr>
@@ -4051,7 +4016,6 @@
           <w:b/>
           <w:bCs/>
           <w:i w:val="false"/>
-          <w:i w:val="false"/>
           <w:caps w:val="false"/>
           <w:smallCaps w:val="false"/>
           <w:strike w:val="false"/>
@@ -4066,7 +4030,7 @@
       </w:pPr>
       <w:r>
         <w:drawing>
-          <wp:anchor behindDoc="0" distT="0" distB="0" distL="0" distR="0" simplePos="0" locked="0" layoutInCell="0" allowOverlap="1" relativeHeight="2">
+          <wp:anchor distT="0" distB="0" distL="0" distR="0" simplePos="0" relativeHeight="2" behindDoc="0" locked="0" layoutInCell="0" allowOverlap="1">
             <wp:simplePos x="0" y="0"/>
             <wp:positionH relativeFrom="column">
               <wp:align>center</wp:align>
@@ -4077,7 +4041,7 @@
             <wp:extent cx="5576570" cy="2383790"/>
             <wp:effectExtent l="0" t="0" r="0" b="0"/>
             <wp:wrapSquare wrapText="largest"/>
-            <wp:docPr id="3" name="Image5" descr=""/>
+            <wp:docPr id="3" name="Image5"/>
             <wp:cNvGraphicFramePr>
               <a:graphicFrameLocks xmlns:a="http://schemas.openxmlformats.org/drawingml/2006/main" noChangeAspect="1"/>
             </wp:cNvGraphicFramePr>
@@ -4085,7 +4049,7 @@
               <a:graphicData uri="http://schemas.openxmlformats.org/drawingml/2006/picture">
                 <pic:pic xmlns:pic="http://schemas.openxmlformats.org/drawingml/2006/picture">
                   <pic:nvPicPr>
-                    <pic:cNvPr id="3" name="Image5" descr=""/>
+                    <pic:cNvPr id="3" name="Image5"/>
                     <pic:cNvPicPr>
                       <a:picLocks noChangeAspect="1" noChangeArrowheads="1"/>
                     </pic:cNvPicPr>
@@ -4104,6 +4068,7 @@
                     <a:prstGeom prst="rect">
                       <a:avLst/>
                     </a:prstGeom>
+                    <a:noFill/>
                   </pic:spPr>
                 </pic:pic>
               </a:graphicData>
@@ -4168,7 +4133,7 @@
         <w:gridCol w:w="3177"/>
         <w:gridCol w:w="1255"/>
         <w:gridCol w:w="900"/>
-        <w:gridCol w:w="5222"/>
+        <w:gridCol w:w="5223"/>
       </w:tblGrid>
       <w:tr>
         <w:trPr/>
@@ -4192,7 +4157,6 @@
                 <w:rFonts w:ascii="Arial;sans-serif" w:hAnsi="Arial;sans-serif"/>
                 <w:b w:val="false"/>
                 <w:bCs w:val="false"/>
-                <w:i w:val="false"/>
                 <w:i w:val="false"/>
                 <w:caps w:val="false"/>
                 <w:smallCaps w:val="false"/>
@@ -4247,7 +4211,6 @@
                 <w:rFonts w:ascii="Arial;sans-serif" w:hAnsi="Arial;sans-serif"/>
                 <w:b w:val="false"/>
                 <w:bCs w:val="false"/>
-                <w:i w:val="false"/>
                 <w:i w:val="false"/>
                 <w:caps w:val="false"/>
                 <w:smallCaps w:val="false"/>
@@ -4305,7 +4268,6 @@
                 <w:b w:val="false"/>
                 <w:bCs w:val="false"/>
                 <w:i w:val="false"/>
-                <w:i w:val="false"/>
                 <w:caps w:val="false"/>
                 <w:smallCaps w:val="false"/>
                 <w:strike w:val="false"/>
@@ -4341,7 +4303,7 @@
         </w:tc>
         <w:tc>
           <w:tcPr>
-            <w:tcW w:w="5222" w:type="dxa"/>
+            <w:tcW w:w="5223" w:type="dxa"/>
             <w:tcBorders>
               <w:top w:val="single" w:sz="8" w:space="0" w:color="000000"/>
               <w:left w:val="single" w:sz="8" w:space="0" w:color="000000"/>
@@ -4360,7 +4322,6 @@
                 <w:rFonts w:ascii="Arial;sans-serif" w:hAnsi="Arial;sans-serif"/>
                 <w:b w:val="false"/>
                 <w:bCs w:val="false"/>
-                <w:i w:val="false"/>
                 <w:i w:val="false"/>
                 <w:caps w:val="false"/>
                 <w:smallCaps w:val="false"/>
@@ -4419,7 +4380,6 @@
                 <w:b w:val="false"/>
                 <w:bCs w:val="false"/>
                 <w:i w:val="false"/>
-                <w:i w:val="false"/>
                 <w:caps w:val="false"/>
                 <w:smallCaps w:val="false"/>
                 <w:strike w:val="false"/>
@@ -4473,7 +4433,6 @@
                 <w:rFonts w:ascii="Arial;sans-serif" w:hAnsi="Arial;sans-serif"/>
                 <w:b w:val="false"/>
                 <w:bCs w:val="false"/>
-                <w:i w:val="false"/>
                 <w:i w:val="false"/>
                 <w:caps w:val="false"/>
                 <w:smallCaps w:val="false"/>
@@ -4531,7 +4490,6 @@
                 <w:b w:val="false"/>
                 <w:bCs w:val="false"/>
                 <w:i w:val="false"/>
-                <w:i w:val="false"/>
                 <w:caps w:val="false"/>
                 <w:smallCaps w:val="false"/>
                 <w:strike w:val="false"/>
@@ -4567,7 +4525,7 @@
         </w:tc>
         <w:tc>
           <w:tcPr>
-            <w:tcW w:w="5222" w:type="dxa"/>
+            <w:tcW w:w="5223" w:type="dxa"/>
             <w:tcBorders>
               <w:top w:val="single" w:sz="8" w:space="0" w:color="000000"/>
               <w:left w:val="single" w:sz="8" w:space="0" w:color="000000"/>
@@ -4586,7 +4544,6 @@
                 <w:rFonts w:ascii="Arial;sans-serif" w:hAnsi="Arial;sans-serif"/>
                 <w:b w:val="false"/>
                 <w:bCs w:val="false"/>
-                <w:i w:val="false"/>
                 <w:i w:val="false"/>
                 <w:caps w:val="false"/>
                 <w:smallCaps w:val="false"/>
@@ -4724,7 +4681,7 @@
         </w:tc>
         <w:tc>
           <w:tcPr>
-            <w:tcW w:w="5222" w:type="dxa"/>
+            <w:tcW w:w="5223" w:type="dxa"/>
             <w:tcBorders>
               <w:top w:val="single" w:sz="8" w:space="0" w:color="000000"/>
               <w:left w:val="single" w:sz="8" w:space="0" w:color="000000"/>
@@ -4777,7 +4734,6 @@
                 <w:b w:val="false"/>
                 <w:bCs w:val="false"/>
                 <w:i w:val="false"/>
-                <w:i w:val="false"/>
                 <w:caps w:val="false"/>
                 <w:smallCaps w:val="false"/>
                 <w:strike w:val="false"/>
@@ -4830,7 +4786,6 @@
                 <w:rFonts w:ascii="Arial;sans-serif" w:hAnsi="Arial;sans-serif"/>
                 <w:b w:val="false"/>
                 <w:bCs w:val="false"/>
-                <w:i w:val="false"/>
                 <w:i w:val="false"/>
                 <w:caps w:val="false"/>
                 <w:smallCaps w:val="false"/>
@@ -4887,7 +4842,6 @@
                 <w:b w:val="false"/>
                 <w:bCs w:val="false"/>
                 <w:i w:val="false"/>
-                <w:i w:val="false"/>
                 <w:caps w:val="false"/>
                 <w:smallCaps w:val="false"/>
                 <w:strike w:val="false"/>
@@ -4923,7 +4877,7 @@
         </w:tc>
         <w:tc>
           <w:tcPr>
-            <w:tcW w:w="5222" w:type="dxa"/>
+            <w:tcW w:w="5223" w:type="dxa"/>
             <w:tcBorders>
               <w:left w:val="single" w:sz="8" w:space="0" w:color="000000"/>
               <w:bottom w:val="single" w:sz="8" w:space="0" w:color="000000"/>
@@ -5081,7 +5035,7 @@
         </w:tc>
         <w:tc>
           <w:tcPr>
-            <w:tcW w:w="5222" w:type="dxa"/>
+            <w:tcW w:w="5223" w:type="dxa"/>
             <w:tcBorders>
               <w:left w:val="single" w:sz="8" w:space="0" w:color="000000"/>
               <w:bottom w:val="single" w:sz="8" w:space="0" w:color="000000"/>
@@ -5120,7 +5074,6 @@
           <w:b/>
           <w:bCs/>
           <w:i w:val="false"/>
-          <w:i w:val="false"/>
           <w:caps w:val="false"/>
           <w:smallCaps w:val="false"/>
           <w:spacing w:val="0"/>
@@ -5208,7 +5161,6 @@
           <w:rFonts w:ascii="rem;Google Sans Text;Google Sans;sans-serif" w:hAnsi="rem;Google Sans Text;Google Sans;sans-serif"/>
           <w:b w:val="false"/>
           <w:i w:val="false"/>
-          <w:i w:val="false"/>
           <w:caps w:val="false"/>
           <w:smallCaps w:val="false"/>
           <w:color w:val="000000"/>
@@ -5304,7 +5256,6 @@
           <w:rFonts w:ascii="rem;Google Sans Text;Google Sans;sans-serif" w:hAnsi="rem;Google Sans Text;Google Sans;sans-serif"/>
           <w:b w:val="false"/>
           <w:i w:val="false"/>
-          <w:i w:val="false"/>
           <w:caps w:val="false"/>
           <w:smallCaps w:val="false"/>
           <w:color w:val="000000"/>
@@ -5358,7 +5309,6 @@
           <w:rFonts w:ascii="rem;Google Sans Text;Google Sans;sans-serif" w:hAnsi="rem;Google Sans Text;Google Sans;sans-serif"/>
           <w:b w:val="false"/>
           <w:i w:val="false"/>
-          <w:i w:val="false"/>
           <w:caps w:val="false"/>
           <w:smallCaps w:val="false"/>
           <w:color w:val="000000"/>
@@ -5792,7 +5742,6 @@
           <w:rFonts w:ascii="rem;Google Sans Text;Google Sans;sans-serif" w:hAnsi="rem;Google Sans Text;Google Sans;sans-serif"/>
           <w:b w:val="false"/>
           <w:bCs w:val="false"/>
-          <w:i w:val="false"/>
           <w:i w:val="false"/>
           <w:caps w:val="false"/>
           <w:smallCaps w:val="false"/>
@@ -6128,7 +6077,6 @@
           <w:b w:val="false"/>
           <w:bCs w:val="false"/>
           <w:i w:val="false"/>
-          <w:i w:val="false"/>
           <w:caps w:val="false"/>
           <w:smallCaps w:val="false"/>
           <w:spacing w:val="0"/>
@@ -6186,7 +6134,6 @@
           <w:b w:val="false"/>
           <w:bCs w:val="false"/>
           <w:i w:val="false"/>
-          <w:i w:val="false"/>
           <w:caps w:val="false"/>
           <w:smallCaps w:val="false"/>
           <w:spacing w:val="0"/>
@@ -6217,7 +6164,6 @@
           <w:b w:val="false"/>
           <w:bCs w:val="false"/>
           <w:i w:val="false"/>
-          <w:i w:val="false"/>
           <w:caps w:val="false"/>
           <w:smallCaps w:val="false"/>
           <w:spacing w:val="0"/>
@@ -6263,7 +6209,6 @@
           <w:rFonts w:ascii="rem;Google Sans Text;Google Sans;sans-serif" w:hAnsi="rem;Google Sans Text;Google Sans;sans-serif"/>
           <w:b w:val="false"/>
           <w:bCs w:val="false"/>
-          <w:i w:val="false"/>
           <w:i w:val="false"/>
           <w:caps w:val="false"/>
           <w:smallCaps w:val="false"/>
@@ -6314,7 +6259,6 @@
           <w:rFonts w:ascii="rem;Google Sans Text;Google Sans;sans-serif" w:hAnsi="rem;Google Sans Text;Google Sans;sans-serif"/>
           <w:b w:val="false"/>
           <w:bCs w:val="false"/>
-          <w:i w:val="false"/>
           <w:i w:val="false"/>
           <w:caps w:val="false"/>
           <w:smallCaps w:val="false"/>
@@ -6351,7 +6295,6 @@
           <w:b w:val="false"/>
           <w:bCs w:val="false"/>
           <w:i w:val="false"/>
-          <w:i w:val="false"/>
           <w:caps w:val="false"/>
           <w:smallCaps w:val="false"/>
           <w:spacing w:val="0"/>
@@ -6385,7 +6328,6 @@
           <w:rFonts w:ascii="rem;Google Sans Text;Google Sans;sans-serif" w:hAnsi="rem;Google Sans Text;Google Sans;sans-serif"/>
           <w:b w:val="false"/>
           <w:bCs w:val="false"/>
-          <w:i w:val="false"/>
           <w:i w:val="false"/>
           <w:caps w:val="false"/>
           <w:smallCaps w:val="false"/>
@@ -6422,7 +6364,6 @@
           <w:b w:val="false"/>
           <w:bCs w:val="false"/>
           <w:i w:val="false"/>
-          <w:i w:val="false"/>
           <w:caps w:val="false"/>
           <w:smallCaps w:val="false"/>
           <w:spacing w:val="0"/>
@@ -6459,7 +6400,7 @@
           <w:szCs w:val="21"/>
         </w:rPr>
         <w:drawing>
-          <wp:anchor behindDoc="0" distT="0" distB="0" distL="0" distR="0" simplePos="0" locked="0" layoutInCell="0" allowOverlap="1" relativeHeight="4">
+          <wp:anchor distT="0" distB="0" distL="0" distR="0" simplePos="0" relativeHeight="4" behindDoc="0" locked="0" layoutInCell="0" allowOverlap="1">
             <wp:simplePos x="0" y="0"/>
             <wp:positionH relativeFrom="column">
               <wp:align>center</wp:align>
@@ -6470,7 +6411,7 @@
             <wp:extent cx="6918325" cy="3033395"/>
             <wp:effectExtent l="0" t="0" r="0" b="0"/>
             <wp:wrapSquare wrapText="largest"/>
-            <wp:docPr id="4" name="Image3" descr=""/>
+            <wp:docPr id="4" name="Image3"/>
             <wp:cNvGraphicFramePr>
               <a:graphicFrameLocks xmlns:a="http://schemas.openxmlformats.org/drawingml/2006/main" noChangeAspect="1"/>
             </wp:cNvGraphicFramePr>
@@ -6478,7 +6419,7 @@
               <a:graphicData uri="http://schemas.openxmlformats.org/drawingml/2006/picture">
                 <pic:pic xmlns:pic="http://schemas.openxmlformats.org/drawingml/2006/picture">
                   <pic:nvPicPr>
-                    <pic:cNvPr id="4" name="Image3" descr=""/>
+                    <pic:cNvPr id="4" name="Image3"/>
                     <pic:cNvPicPr>
                       <a:picLocks noChangeAspect="1" noChangeArrowheads="1"/>
                     </pic:cNvPicPr>
@@ -6497,6 +6438,7 @@
                     <a:prstGeom prst="rect">
                       <a:avLst/>
                     </a:prstGeom>
+                    <a:noFill/>
                   </pic:spPr>
                 </pic:pic>
               </a:graphicData>
@@ -6513,7 +6455,6 @@
           <w:b w:val="false"/>
           <w:bCs w:val="false"/>
           <w:i w:val="false"/>
-          <w:i w:val="false"/>
           <w:caps w:val="false"/>
           <w:smallCaps w:val="false"/>
           <w:spacing w:val="0"/>
@@ -6544,7 +6485,6 @@
           <w:rFonts w:ascii="rem;Google Sans Text;Google Sans;sans-serif" w:hAnsi="rem;Google Sans Text;Google Sans;sans-serif"/>
           <w:b w:val="false"/>
           <w:bCs w:val="false"/>
-          <w:i w:val="false"/>
           <w:i w:val="false"/>
           <w:caps w:val="false"/>
           <w:smallCaps w:val="false"/>
@@ -6599,7 +6539,7 @@
         <w:gridCol w:w="3177"/>
         <w:gridCol w:w="1255"/>
         <w:gridCol w:w="900"/>
-        <w:gridCol w:w="5222"/>
+        <w:gridCol w:w="5223"/>
       </w:tblGrid>
       <w:tr>
         <w:trPr/>
@@ -6623,7 +6563,6 @@
                 <w:rFonts w:ascii="Arial;sans-serif" w:hAnsi="Arial;sans-serif"/>
                 <w:b w:val="false"/>
                 <w:bCs w:val="false"/>
-                <w:i w:val="false"/>
                 <w:i w:val="false"/>
                 <w:caps w:val="false"/>
                 <w:smallCaps w:val="false"/>
@@ -6678,7 +6617,6 @@
                 <w:rFonts w:ascii="Arial;sans-serif" w:hAnsi="Arial;sans-serif"/>
                 <w:b w:val="false"/>
                 <w:bCs w:val="false"/>
-                <w:i w:val="false"/>
                 <w:i w:val="false"/>
                 <w:caps w:val="false"/>
                 <w:smallCaps w:val="false"/>
@@ -6736,7 +6674,6 @@
                 <w:b w:val="false"/>
                 <w:bCs w:val="false"/>
                 <w:i w:val="false"/>
-                <w:i w:val="false"/>
                 <w:caps w:val="false"/>
                 <w:smallCaps w:val="false"/>
                 <w:strike w:val="false"/>
@@ -6772,7 +6709,7 @@
         </w:tc>
         <w:tc>
           <w:tcPr>
-            <w:tcW w:w="5222" w:type="dxa"/>
+            <w:tcW w:w="5223" w:type="dxa"/>
             <w:tcBorders>
               <w:top w:val="single" w:sz="8" w:space="0" w:color="000000"/>
               <w:left w:val="single" w:sz="8" w:space="0" w:color="000000"/>
@@ -6791,7 +6728,6 @@
                 <w:rFonts w:ascii="Arial;sans-serif" w:hAnsi="Arial;sans-serif"/>
                 <w:b w:val="false"/>
                 <w:bCs w:val="false"/>
-                <w:i w:val="false"/>
                 <w:i w:val="false"/>
                 <w:caps w:val="false"/>
                 <w:smallCaps w:val="false"/>
@@ -6850,7 +6786,6 @@
                 <w:b w:val="false"/>
                 <w:bCs w:val="false"/>
                 <w:i w:val="false"/>
-                <w:i w:val="false"/>
                 <w:caps w:val="false"/>
                 <w:smallCaps w:val="false"/>
                 <w:strike w:val="false"/>
@@ -6904,7 +6839,6 @@
                 <w:rFonts w:ascii="Arial;sans-serif" w:hAnsi="Arial;sans-serif"/>
                 <w:b w:val="false"/>
                 <w:bCs w:val="false"/>
-                <w:i w:val="false"/>
                 <w:i w:val="false"/>
                 <w:caps w:val="false"/>
                 <w:smallCaps w:val="false"/>
@@ -6962,7 +6896,6 @@
                 <w:b w:val="false"/>
                 <w:bCs w:val="false"/>
                 <w:i w:val="false"/>
-                <w:i w:val="false"/>
                 <w:caps w:val="false"/>
                 <w:smallCaps w:val="false"/>
                 <w:strike w:val="false"/>
@@ -6998,7 +6931,7 @@
         </w:tc>
         <w:tc>
           <w:tcPr>
-            <w:tcW w:w="5222" w:type="dxa"/>
+            <w:tcW w:w="5223" w:type="dxa"/>
             <w:tcBorders>
               <w:top w:val="single" w:sz="8" w:space="0" w:color="000000"/>
               <w:left w:val="single" w:sz="8" w:space="0" w:color="000000"/>
@@ -7017,7 +6950,6 @@
                 <w:rFonts w:ascii="Arial;sans-serif" w:hAnsi="Arial;sans-serif"/>
                 <w:b w:val="false"/>
                 <w:bCs w:val="false"/>
-                <w:i w:val="false"/>
                 <w:i w:val="false"/>
                 <w:caps w:val="false"/>
                 <w:smallCaps w:val="false"/>
@@ -7075,7 +7007,6 @@
                 <w:b w:val="false"/>
                 <w:bCs w:val="false"/>
                 <w:i w:val="false"/>
-                <w:i w:val="false"/>
                 <w:caps w:val="false"/>
                 <w:smallCaps w:val="false"/>
                 <w:strike w:val="false"/>
@@ -7128,7 +7059,6 @@
                 <w:rFonts w:ascii="Arial;sans-serif" w:hAnsi="Arial;sans-serif"/>
                 <w:b w:val="false"/>
                 <w:bCs w:val="false"/>
-                <w:i w:val="false"/>
                 <w:i w:val="false"/>
                 <w:caps w:val="false"/>
                 <w:smallCaps w:val="false"/>
@@ -7185,7 +7115,6 @@
                 <w:b w:val="false"/>
                 <w:bCs w:val="false"/>
                 <w:i w:val="false"/>
-                <w:i w:val="false"/>
                 <w:caps w:val="false"/>
                 <w:smallCaps w:val="false"/>
                 <w:strike w:val="false"/>
@@ -7221,7 +7150,7 @@
         </w:tc>
         <w:tc>
           <w:tcPr>
-            <w:tcW w:w="5222" w:type="dxa"/>
+            <w:tcW w:w="5223" w:type="dxa"/>
             <w:tcBorders>
               <w:left w:val="single" w:sz="8" w:space="0" w:color="000000"/>
               <w:bottom w:val="single" w:sz="8" w:space="0" w:color="000000"/>
@@ -7239,7 +7168,6 @@
                 <w:rFonts w:ascii="Arial;sans-serif" w:hAnsi="Arial;sans-serif"/>
                 <w:b w:val="false"/>
                 <w:bCs w:val="false"/>
-                <w:i w:val="false"/>
                 <w:i w:val="false"/>
                 <w:caps w:val="false"/>
                 <w:smallCaps w:val="false"/>
@@ -7297,7 +7225,6 @@
                 <w:b w:val="false"/>
                 <w:bCs w:val="false"/>
                 <w:i w:val="false"/>
-                <w:i w:val="false"/>
                 <w:caps w:val="false"/>
                 <w:smallCaps w:val="false"/>
                 <w:strike w:val="false"/>
@@ -7350,7 +7277,6 @@
                 <w:rFonts w:ascii="Arial;sans-serif" w:hAnsi="Arial;sans-serif"/>
                 <w:b w:val="false"/>
                 <w:bCs w:val="false"/>
-                <w:i w:val="false"/>
                 <w:i w:val="false"/>
                 <w:caps w:val="false"/>
                 <w:smallCaps w:val="false"/>
@@ -7407,7 +7333,6 @@
                 <w:b w:val="false"/>
                 <w:bCs w:val="false"/>
                 <w:i w:val="false"/>
-                <w:i w:val="false"/>
                 <w:caps w:val="false"/>
                 <w:smallCaps w:val="false"/>
                 <w:strike w:val="false"/>
@@ -7443,7 +7368,7 @@
         </w:tc>
         <w:tc>
           <w:tcPr>
-            <w:tcW w:w="5222" w:type="dxa"/>
+            <w:tcW w:w="5223" w:type="dxa"/>
             <w:tcBorders>
               <w:left w:val="single" w:sz="8" w:space="0" w:color="000000"/>
               <w:bottom w:val="single" w:sz="8" w:space="0" w:color="000000"/>
@@ -7461,7 +7386,6 @@
                 <w:rFonts w:ascii="Arial;sans-serif" w:hAnsi="Arial;sans-serif"/>
                 <w:b w:val="false"/>
                 <w:bCs w:val="false"/>
-                <w:i w:val="false"/>
                 <w:i w:val="false"/>
                 <w:caps w:val="false"/>
                 <w:smallCaps w:val="false"/>
@@ -7519,7 +7443,6 @@
                 <w:b w:val="false"/>
                 <w:bCs w:val="false"/>
                 <w:i w:val="false"/>
-                <w:i w:val="false"/>
                 <w:caps w:val="false"/>
                 <w:smallCaps w:val="false"/>
                 <w:strike w:val="false"/>
@@ -7572,7 +7495,6 @@
                 <w:rFonts w:ascii="Arial;sans-serif" w:hAnsi="Arial;sans-serif"/>
                 <w:b w:val="false"/>
                 <w:bCs w:val="false"/>
-                <w:i w:val="false"/>
                 <w:i w:val="false"/>
                 <w:caps w:val="false"/>
                 <w:smallCaps w:val="false"/>
@@ -7629,7 +7551,6 @@
                 <w:b w:val="false"/>
                 <w:bCs w:val="false"/>
                 <w:i w:val="false"/>
-                <w:i w:val="false"/>
                 <w:caps w:val="false"/>
                 <w:smallCaps w:val="false"/>
                 <w:strike w:val="false"/>
@@ -7665,7 +7586,7 @@
         </w:tc>
         <w:tc>
           <w:tcPr>
-            <w:tcW w:w="5222" w:type="dxa"/>
+            <w:tcW w:w="5223" w:type="dxa"/>
             <w:tcBorders>
               <w:left w:val="single" w:sz="8" w:space="0" w:color="000000"/>
               <w:bottom w:val="single" w:sz="8" w:space="0" w:color="000000"/>
@@ -7683,7 +7604,6 @@
                 <w:rFonts w:ascii="Arial;sans-serif" w:hAnsi="Arial;sans-serif"/>
                 <w:b w:val="false"/>
                 <w:bCs w:val="false"/>
-                <w:i w:val="false"/>
                 <w:i w:val="false"/>
                 <w:caps w:val="false"/>
                 <w:smallCaps w:val="false"/>
@@ -7741,7 +7661,6 @@
                 <w:b w:val="false"/>
                 <w:bCs w:val="false"/>
                 <w:i w:val="false"/>
-                <w:i w:val="false"/>
                 <w:caps w:val="false"/>
                 <w:smallCaps w:val="false"/>
                 <w:strike w:val="false"/>
@@ -7794,7 +7713,6 @@
                 <w:rFonts w:ascii="Arial;sans-serif" w:hAnsi="Arial;sans-serif"/>
                 <w:b w:val="false"/>
                 <w:bCs w:val="false"/>
-                <w:i w:val="false"/>
                 <w:i w:val="false"/>
                 <w:caps w:val="false"/>
                 <w:smallCaps w:val="false"/>
@@ -7851,7 +7769,6 @@
                 <w:b w:val="false"/>
                 <w:bCs w:val="false"/>
                 <w:i w:val="false"/>
-                <w:i w:val="false"/>
                 <w:caps w:val="false"/>
                 <w:smallCaps w:val="false"/>
                 <w:strike w:val="false"/>
@@ -7887,7 +7804,7 @@
         </w:tc>
         <w:tc>
           <w:tcPr>
-            <w:tcW w:w="5222" w:type="dxa"/>
+            <w:tcW w:w="5223" w:type="dxa"/>
             <w:tcBorders>
               <w:left w:val="single" w:sz="8" w:space="0" w:color="000000"/>
               <w:bottom w:val="single" w:sz="8" w:space="0" w:color="000000"/>
@@ -7906,7 +7823,6 @@
                 <w:b w:val="false"/>
                 <w:bCs w:val="false"/>
                 <w:i w:val="false"/>
-                <w:i w:val="false"/>
                 <w:caps w:val="false"/>
                 <w:smallCaps w:val="false"/>
                 <w:strike w:val="false"/>
@@ -8038,7 +7954,6 @@
           <w:b w:val="false"/>
           <w:bCs/>
           <w:i w:val="false"/>
-          <w:i w:val="false"/>
           <w:caps w:val="false"/>
           <w:smallCaps w:val="false"/>
           <w:color w:val="000000"/>
@@ -8129,7 +8044,6 @@
           <w:rFonts w:ascii="rem;Google Sans Text;Google Sans;sans-serif" w:hAnsi="rem;Google Sans Text;Google Sans;sans-serif"/>
           <w:b/>
           <w:i w:val="false"/>
-          <w:i w:val="false"/>
           <w:caps w:val="false"/>
           <w:smallCaps w:val="false"/>
           <w:spacing w:val="0"/>
@@ -8157,7 +8071,6 @@
           <w:rFonts w:ascii="rem;Google Sans Text;Google Sans;sans-serif" w:hAnsi="rem;Google Sans Text;Google Sans;sans-serif"/>
           <w:b/>
           <w:i w:val="false"/>
-          <w:i w:val="false"/>
           <w:caps w:val="false"/>
           <w:smallCaps w:val="false"/>
           <w:spacing w:val="0"/>
@@ -8258,7 +8171,6 @@
           <w:rFonts w:ascii="rem;Google Sans Text;Google Sans;sans-serif" w:hAnsi="rem;Google Sans Text;Google Sans;sans-serif"/>
           <w:b/>
           <w:i w:val="false"/>
-          <w:i w:val="false"/>
           <w:caps w:val="false"/>
           <w:smallCaps w:val="false"/>
           <w:spacing w:val="0"/>
@@ -8402,7 +8314,6 @@
           <w:rFonts w:ascii="rem;Google Sans Text;Google Sans;sans-serif" w:hAnsi="rem;Google Sans Text;Google Sans;sans-serif"/>
           <w:b/>
           <w:i w:val="false"/>
-          <w:i w:val="false"/>
           <w:caps w:val="false"/>
           <w:smallCaps w:val="false"/>
           <w:spacing w:val="0"/>
@@ -8506,7 +8417,6 @@
           <w:rFonts w:ascii="rem;Google Sans Text;Google Sans;sans-serif" w:hAnsi="rem;Google Sans Text;Google Sans;sans-serif"/>
           <w:b/>
           <w:i w:val="false"/>
-          <w:i w:val="false"/>
           <w:caps w:val="false"/>
           <w:smallCaps w:val="false"/>
           <w:spacing w:val="0"/>
@@ -8538,7 +8448,6 @@
           <w:b/>
           <w:bCs/>
           <w:i w:val="false"/>
-          <w:i w:val="false"/>
           <w:caps w:val="false"/>
           <w:smallCaps w:val="false"/>
           <w:spacing w:val="0"/>
@@ -8674,7 +8583,6 @@
           <w:rFonts w:ascii="rem;Google Sans Text;Google Sans;sans-serif" w:hAnsi="rem;Google Sans Text;Google Sans;sans-serif"/>
           <w:b/>
           <w:i w:val="false"/>
-          <w:i w:val="false"/>
           <w:caps w:val="false"/>
           <w:smallCaps w:val="false"/>
           <w:spacing w:val="0"/>
@@ -8704,7 +8612,6 @@
           <w:rFonts w:ascii="rem;Google Sans Text;Google Sans;sans-serif" w:hAnsi="rem;Google Sans Text;Google Sans;sans-serif"/>
           <w:b/>
           <w:i w:val="false"/>
-          <w:i w:val="false"/>
           <w:caps w:val="false"/>
           <w:smallCaps w:val="false"/>
           <w:spacing w:val="0"/>
@@ -8736,7 +8643,6 @@
           <w:rFonts w:ascii="rem;Google Sans Text;Google Sans;sans-serif" w:hAnsi="rem;Google Sans Text;Google Sans;sans-serif"/>
           <w:b/>
           <w:i w:val="false"/>
-          <w:i w:val="false"/>
           <w:caps w:val="false"/>
           <w:smallCaps w:val="false"/>
           <w:spacing w:val="0"/>
@@ -8815,7 +8721,6 @@
           <w:rFonts w:ascii="rem;Google Sans Text;Google Sans;sans-serif" w:hAnsi="rem;Google Sans Text;Google Sans;sans-serif"/>
           <w:b/>
           <w:i w:val="false"/>
-          <w:i w:val="false"/>
           <w:caps w:val="false"/>
           <w:smallCaps w:val="false"/>
           <w:spacing w:val="0"/>
@@ -8860,7 +8765,6 @@
           <w:rFonts w:ascii="rem;Google Sans Text;Google Sans;sans-serif" w:hAnsi="rem;Google Sans Text;Google Sans;sans-serif"/>
           <w:b w:val="false"/>
           <w:bCs w:val="false"/>
-          <w:i w:val="false"/>
           <w:i w:val="false"/>
           <w:caps w:val="false"/>
           <w:smallCaps w:val="false"/>
@@ -8912,7 +8816,6 @@
           <w:rFonts w:ascii="rem;Google Sans Text;Google Sans;sans-serif" w:hAnsi="rem;Google Sans Text;Google Sans;sans-serif"/>
           <w:b w:val="false"/>
           <w:bCs w:val="false"/>
-          <w:i w:val="false"/>
           <w:i w:val="false"/>
           <w:caps w:val="false"/>
           <w:smallCaps w:val="false"/>
@@ -9061,7 +8964,7 @@
           <w:szCs w:val="21"/>
         </w:rPr>
         <w:drawing>
-          <wp:anchor behindDoc="0" distT="0" distB="0" distL="0" distR="0" simplePos="0" locked="0" layoutInCell="0" allowOverlap="1" relativeHeight="5">
+          <wp:anchor distT="0" distB="0" distL="0" distR="0" simplePos="0" relativeHeight="5" behindDoc="0" locked="0" layoutInCell="0" allowOverlap="1">
             <wp:simplePos x="0" y="0"/>
             <wp:positionH relativeFrom="column">
               <wp:align>center</wp:align>
@@ -9072,7 +8975,7 @@
             <wp:extent cx="5270500" cy="3416300"/>
             <wp:effectExtent l="0" t="0" r="0" b="0"/>
             <wp:wrapSquare wrapText="largest"/>
-            <wp:docPr id="5" name="Image4" descr=""/>
+            <wp:docPr id="5" name="Image4"/>
             <wp:cNvGraphicFramePr>
               <a:graphicFrameLocks xmlns:a="http://schemas.openxmlformats.org/drawingml/2006/main" noChangeAspect="1"/>
             </wp:cNvGraphicFramePr>
@@ -9080,7 +8983,7 @@
               <a:graphicData uri="http://schemas.openxmlformats.org/drawingml/2006/picture">
                 <pic:pic xmlns:pic="http://schemas.openxmlformats.org/drawingml/2006/picture">
                   <pic:nvPicPr>
-                    <pic:cNvPr id="5" name="Image4" descr=""/>
+                    <pic:cNvPr id="5" name="Image4"/>
                     <pic:cNvPicPr>
                       <a:picLocks noChangeAspect="1" noChangeArrowheads="1"/>
                     </pic:cNvPicPr>
@@ -9099,6 +9002,7 @@
                     <a:prstGeom prst="rect">
                       <a:avLst/>
                     </a:prstGeom>
+                    <a:noFill/>
                   </pic:spPr>
                 </pic:pic>
               </a:graphicData>
@@ -9115,7 +9019,6 @@
         <w:rPr>
           <w:rFonts w:ascii="rem;Google Sans Text;Google Sans;sans-serif" w:hAnsi="rem;Google Sans Text;Google Sans;sans-serif"/>
           <w:b/>
-          <w:i w:val="false"/>
           <w:i w:val="false"/>
           <w:caps w:val="false"/>
           <w:smallCaps w:val="false"/>
@@ -9155,7 +9058,7 @@
         <w:gridCol w:w="3177"/>
         <w:gridCol w:w="1255"/>
         <w:gridCol w:w="900"/>
-        <w:gridCol w:w="5222"/>
+        <w:gridCol w:w="5223"/>
       </w:tblGrid>
       <w:tr>
         <w:trPr/>
@@ -9179,7 +9082,6 @@
                 <w:rFonts w:ascii="Arial;sans-serif" w:hAnsi="Arial;sans-serif"/>
                 <w:b w:val="false"/>
                 <w:bCs w:val="false"/>
-                <w:i w:val="false"/>
                 <w:i w:val="false"/>
                 <w:caps w:val="false"/>
                 <w:smallCaps w:val="false"/>
@@ -9234,7 +9136,6 @@
                 <w:rFonts w:ascii="Arial;sans-serif" w:hAnsi="Arial;sans-serif"/>
                 <w:b w:val="false"/>
                 <w:bCs w:val="false"/>
-                <w:i w:val="false"/>
                 <w:i w:val="false"/>
                 <w:caps w:val="false"/>
                 <w:smallCaps w:val="false"/>
@@ -9292,7 +9193,6 @@
                 <w:b w:val="false"/>
                 <w:bCs w:val="false"/>
                 <w:i w:val="false"/>
-                <w:i w:val="false"/>
                 <w:caps w:val="false"/>
                 <w:smallCaps w:val="false"/>
                 <w:strike w:val="false"/>
@@ -9328,7 +9228,7 @@
         </w:tc>
         <w:tc>
           <w:tcPr>
-            <w:tcW w:w="5222" w:type="dxa"/>
+            <w:tcW w:w="5223" w:type="dxa"/>
             <w:tcBorders>
               <w:top w:val="single" w:sz="8" w:space="0" w:color="000000"/>
               <w:left w:val="single" w:sz="8" w:space="0" w:color="000000"/>
@@ -9347,7 +9247,6 @@
                 <w:rFonts w:ascii="Arial;sans-serif" w:hAnsi="Arial;sans-serif"/>
                 <w:b w:val="false"/>
                 <w:bCs w:val="false"/>
-                <w:i w:val="false"/>
                 <w:i w:val="false"/>
                 <w:caps w:val="false"/>
                 <w:smallCaps w:val="false"/>
@@ -9406,7 +9305,6 @@
                 <w:b w:val="false"/>
                 <w:bCs w:val="false"/>
                 <w:i w:val="false"/>
-                <w:i w:val="false"/>
                 <w:caps w:val="false"/>
                 <w:smallCaps w:val="false"/>
                 <w:strike w:val="false"/>
@@ -9460,7 +9358,6 @@
                 <w:rFonts w:ascii="Arial;sans-serif" w:hAnsi="Arial;sans-serif"/>
                 <w:b w:val="false"/>
                 <w:bCs w:val="false"/>
-                <w:i w:val="false"/>
                 <w:i w:val="false"/>
                 <w:caps w:val="false"/>
                 <w:smallCaps w:val="false"/>
@@ -9518,7 +9415,6 @@
                 <w:b w:val="false"/>
                 <w:bCs w:val="false"/>
                 <w:i w:val="false"/>
-                <w:i w:val="false"/>
                 <w:caps w:val="false"/>
                 <w:smallCaps w:val="false"/>
                 <w:strike w:val="false"/>
@@ -9554,7 +9450,7 @@
         </w:tc>
         <w:tc>
           <w:tcPr>
-            <w:tcW w:w="5222" w:type="dxa"/>
+            <w:tcW w:w="5223" w:type="dxa"/>
             <w:tcBorders>
               <w:top w:val="single" w:sz="8" w:space="0" w:color="000000"/>
               <w:left w:val="single" w:sz="8" w:space="0" w:color="000000"/>
@@ -9573,7 +9469,6 @@
                 <w:rFonts w:ascii="Arial;sans-serif" w:hAnsi="Arial;sans-serif"/>
                 <w:b w:val="false"/>
                 <w:bCs w:val="false"/>
-                <w:i w:val="false"/>
                 <w:i w:val="false"/>
                 <w:caps w:val="false"/>
                 <w:smallCaps w:val="false"/>
@@ -9631,7 +9526,6 @@
                 <w:b w:val="false"/>
                 <w:bCs w:val="false"/>
                 <w:i w:val="false"/>
-                <w:i w:val="false"/>
                 <w:caps w:val="false"/>
                 <w:smallCaps w:val="false"/>
                 <w:strike w:val="false"/>
@@ -9684,7 +9578,6 @@
                 <w:rFonts w:ascii="Arial;sans-serif" w:hAnsi="Arial;sans-serif"/>
                 <w:b w:val="false"/>
                 <w:bCs w:val="false"/>
-                <w:i w:val="false"/>
                 <w:i w:val="false"/>
                 <w:caps w:val="false"/>
                 <w:smallCaps w:val="false"/>
@@ -9741,7 +9634,6 @@
                 <w:b w:val="false"/>
                 <w:bCs w:val="false"/>
                 <w:i w:val="false"/>
-                <w:i w:val="false"/>
                 <w:caps w:val="false"/>
                 <w:smallCaps w:val="false"/>
                 <w:strike w:val="false"/>
@@ -9777,7 +9669,7 @@
         </w:tc>
         <w:tc>
           <w:tcPr>
-            <w:tcW w:w="5222" w:type="dxa"/>
+            <w:tcW w:w="5223" w:type="dxa"/>
             <w:tcBorders>
               <w:left w:val="single" w:sz="8" w:space="0" w:color="000000"/>
               <w:bottom w:val="single" w:sz="8" w:space="0" w:color="000000"/>
@@ -9795,7 +9687,6 @@
                 <w:rFonts w:ascii="Arial;sans-serif" w:hAnsi="Arial;sans-serif"/>
                 <w:b w:val="false"/>
                 <w:bCs w:val="false"/>
-                <w:i w:val="false"/>
                 <w:i w:val="false"/>
                 <w:caps w:val="false"/>
                 <w:smallCaps w:val="false"/>
@@ -9853,7 +9744,6 @@
                 <w:b w:val="false"/>
                 <w:bCs w:val="false"/>
                 <w:i w:val="false"/>
-                <w:i w:val="false"/>
                 <w:caps w:val="false"/>
                 <w:smallCaps w:val="false"/>
                 <w:strike w:val="false"/>
@@ -9906,7 +9796,6 @@
                 <w:rFonts w:ascii="Arial;sans-serif" w:hAnsi="Arial;sans-serif"/>
                 <w:b w:val="false"/>
                 <w:bCs w:val="false"/>
-                <w:i w:val="false"/>
                 <w:i w:val="false"/>
                 <w:caps w:val="false"/>
                 <w:smallCaps w:val="false"/>
@@ -9963,7 +9852,6 @@
                 <w:b w:val="false"/>
                 <w:bCs w:val="false"/>
                 <w:i w:val="false"/>
-                <w:i w:val="false"/>
                 <w:caps w:val="false"/>
                 <w:smallCaps w:val="false"/>
                 <w:strike w:val="false"/>
@@ -9999,7 +9887,7 @@
         </w:tc>
         <w:tc>
           <w:tcPr>
-            <w:tcW w:w="5222" w:type="dxa"/>
+            <w:tcW w:w="5223" w:type="dxa"/>
             <w:tcBorders>
               <w:left w:val="single" w:sz="8" w:space="0" w:color="000000"/>
               <w:bottom w:val="single" w:sz="8" w:space="0" w:color="000000"/>
@@ -10017,7 +9905,6 @@
                 <w:rFonts w:ascii="Arial;sans-serif" w:hAnsi="Arial;sans-serif"/>
                 <w:b w:val="false"/>
                 <w:bCs w:val="false"/>
-                <w:i w:val="false"/>
                 <w:i w:val="false"/>
                 <w:caps w:val="false"/>
                 <w:smallCaps w:val="false"/>
@@ -10075,7 +9962,6 @@
                 <w:b w:val="false"/>
                 <w:bCs w:val="false"/>
                 <w:i w:val="false"/>
-                <w:i w:val="false"/>
                 <w:caps w:val="false"/>
                 <w:smallCaps w:val="false"/>
                 <w:strike w:val="false"/>
@@ -10128,7 +10014,6 @@
                 <w:rFonts w:ascii="Arial;sans-serif" w:hAnsi="Arial;sans-serif"/>
                 <w:b w:val="false"/>
                 <w:bCs w:val="false"/>
-                <w:i w:val="false"/>
                 <w:i w:val="false"/>
                 <w:caps w:val="false"/>
                 <w:smallCaps w:val="false"/>
@@ -10185,7 +10070,6 @@
                 <w:b w:val="false"/>
                 <w:bCs w:val="false"/>
                 <w:i w:val="false"/>
-                <w:i w:val="false"/>
                 <w:caps w:val="false"/>
                 <w:smallCaps w:val="false"/>
                 <w:strike w:val="false"/>
@@ -10221,7 +10105,7 @@
         </w:tc>
         <w:tc>
           <w:tcPr>
-            <w:tcW w:w="5222" w:type="dxa"/>
+            <w:tcW w:w="5223" w:type="dxa"/>
             <w:tcBorders>
               <w:left w:val="single" w:sz="8" w:space="0" w:color="000000"/>
               <w:bottom w:val="single" w:sz="8" w:space="0" w:color="000000"/>
@@ -10240,7 +10124,6 @@
                 <w:b w:val="false"/>
                 <w:bCs w:val="false"/>
                 <w:i w:val="false"/>
-                <w:i w:val="false"/>
                 <w:caps w:val="false"/>
                 <w:smallCaps w:val="false"/>
                 <w:strike w:val="false"/>
@@ -10285,7 +10168,6 @@
           <w:rFonts w:ascii="rem;Google Sans Text;Google Sans;sans-serif" w:hAnsi="rem;Google Sans Text;Google Sans;sans-serif"/>
           <w:b/>
           <w:i w:val="false"/>
-          <w:i w:val="false"/>
           <w:caps w:val="false"/>
           <w:smallCaps w:val="false"/>
           <w:spacing w:val="0"/>
@@ -10316,7 +10198,6 @@
           <w:rFonts w:ascii="rem;Google Sans Text;Google Sans;sans-serif" w:hAnsi="rem;Google Sans Text;Google Sans;sans-serif"/>
           <w:b w:val="false"/>
           <w:i w:val="false"/>
-          <w:i w:val="false"/>
           <w:caps w:val="false"/>
           <w:smallCaps w:val="false"/>
           <w:spacing w:val="0"/>
@@ -10346,7 +10227,6 @@
           <w:rFonts w:ascii="rem;Google Sans Text;Google Sans;sans-serif" w:hAnsi="rem;Google Sans Text;Google Sans;sans-serif"/>
           <w:b/>
           <w:i w:val="false"/>
-          <w:i w:val="false"/>
           <w:caps w:val="false"/>
           <w:smallCaps w:val="false"/>
           <w:spacing w:val="0"/>
@@ -10376,7 +10256,6 @@
           <w:rFonts w:ascii="rem;Google Sans Text;Google Sans;sans-serif" w:hAnsi="rem;Google Sans Text;Google Sans;sans-serif"/>
           <w:b w:val="false"/>
           <w:i w:val="false"/>
-          <w:i w:val="false"/>
           <w:caps w:val="false"/>
           <w:smallCaps w:val="false"/>
           <w:spacing w:val="0"/>
@@ -10570,7 +10449,6 @@
         <w:rPr>
           <w:rFonts w:ascii="rem;Google Sans Text;Google Sans;sans-serif" w:hAnsi="rem;Google Sans Text;Google Sans;sans-serif"/>
           <w:b/>
-          <w:i w:val="false"/>
           <w:i w:val="false"/>
           <w:caps w:val="false"/>
           <w:smallCaps w:val="false"/>
@@ -10766,7 +10644,6 @@
           <w:rFonts w:ascii="rem;Google Sans Text;Google Sans;sans-serif" w:hAnsi="rem;Google Sans Text;Google Sans;sans-serif"/>
           <w:b/>
           <w:i w:val="false"/>
-          <w:i w:val="false"/>
           <w:caps w:val="false"/>
           <w:smallCaps w:val="false"/>
           <w:spacing w:val="0"/>
@@ -10842,7 +10719,6 @@
           <w:rFonts w:ascii="rem;Google Sans Text;Google Sans;sans-serif" w:hAnsi="rem;Google Sans Text;Google Sans;sans-serif"/>
           <w:b/>
           <w:i w:val="false"/>
-          <w:i w:val="false"/>
           <w:caps w:val="false"/>
           <w:smallCaps w:val="false"/>
           <w:spacing w:val="0"/>
@@ -10870,7 +10746,6 @@
           <w:rFonts w:ascii="rem;Google Sans Text;Google Sans;sans-serif" w:hAnsi="rem;Google Sans Text;Google Sans;sans-serif"/>
           <w:b/>
           <w:i w:val="false"/>
-          <w:i w:val="false"/>
           <w:caps w:val="false"/>
           <w:smallCaps w:val="false"/>
           <w:spacing w:val="0"/>
@@ -10900,7 +10775,6 @@
           <w:rFonts w:ascii="rem;Google Sans Text;Google Sans;sans-serif" w:hAnsi="rem;Google Sans Text;Google Sans;sans-serif"/>
           <w:b w:val="false"/>
           <w:i w:val="false"/>
-          <w:i w:val="false"/>
           <w:caps w:val="false"/>
           <w:smallCaps w:val="false"/>
           <w:spacing w:val="0"/>
@@ -10984,7 +10858,6 @@
           <w:rFonts w:ascii="rem;Google Sans Text;Google Sans;sans-serif" w:hAnsi="rem;Google Sans Text;Google Sans;sans-serif"/>
           <w:b/>
           <w:i w:val="false"/>
-          <w:i w:val="false"/>
           <w:caps w:val="false"/>
           <w:smallCaps w:val="false"/>
           <w:spacing w:val="0"/>
@@ -11041,7 +10914,6 @@
         <w:bidi w:val="0"/>
         <w:jc w:val="left"/>
         <w:rPr>
-          <w:i w:val="false"/>
           <w:i w:val="false"/>
           <w:iCs w:val="false"/>
           <w:u w:val="none"/>
@@ -11067,7 +10939,6 @@
           <w:b w:val="false"/>
           <w:bCs w:val="false"/>
           <w:i w:val="false"/>
-          <w:i w:val="false"/>
           <w:caps w:val="false"/>
           <w:smallCaps w:val="false"/>
           <w:color w:val="000000"/>
@@ -11104,7 +10975,6 @@
           <w:b w:val="false"/>
           <w:bCs w:val="false"/>
           <w:i w:val="false"/>
-          <w:i w:val="false"/>
           <w:caps w:val="false"/>
           <w:smallCaps w:val="false"/>
           <w:color w:val="000000"/>
@@ -11188,7 +11058,6 @@
         <w:jc w:val="left"/>
         <w:rPr>
           <w:rFonts w:ascii="rem;Google Sans Text;Google Sans;sans-serif" w:hAnsi="rem;Google Sans Text;Google Sans;sans-serif"/>
-          <w:i w:val="false"/>
           <w:i w:val="false"/>
           <w:caps w:val="false"/>
           <w:smallCaps w:val="false"/>
@@ -11797,7 +11666,6 @@
           <w:b w:val="false"/>
           <w:bCs w:val="false"/>
           <w:i w:val="false"/>
-          <w:i w:val="false"/>
           <w:caps w:val="false"/>
           <w:smallCaps w:val="false"/>
           <w:color w:val="000000"/>
@@ -11831,7 +11699,6 @@
           <w:b w:val="false"/>
           <w:bCs w:val="false"/>
           <w:i w:val="false"/>
-          <w:i w:val="false"/>
           <w:caps w:val="false"/>
           <w:smallCaps w:val="false"/>
           <w:color w:val="000000"/>
@@ -11864,7 +11731,6 @@
           <w:rFonts w:ascii="rem;Google Sans Text;Google Sans;sans-serif" w:hAnsi="rem;Google Sans Text;Google Sans;sans-serif"/>
           <w:b w:val="false"/>
           <w:bCs w:val="false"/>
-          <w:i w:val="false"/>
           <w:i w:val="false"/>
           <w:caps w:val="false"/>
           <w:smallCaps w:val="false"/>
@@ -11974,7 +11840,6 @@
           <w:b w:val="false"/>
           <w:bCs w:val="false"/>
           <w:i w:val="false"/>
-          <w:i w:val="false"/>
           <w:caps w:val="false"/>
           <w:smallCaps w:val="false"/>
           <w:color w:val="000000"/>
@@ -12114,7 +11979,6 @@
           <w:b w:val="false"/>
           <w:bCs w:val="false"/>
           <w:i w:val="false"/>
-          <w:i w:val="false"/>
           <w:caps w:val="false"/>
           <w:smallCaps w:val="false"/>
           <w:color w:val="000000"/>
@@ -12361,7 +12225,6 @@
           <w:b w:val="false"/>
           <w:bCs w:val="false"/>
           <w:i w:val="false"/>
-          <w:i w:val="false"/>
           <w:caps w:val="false"/>
           <w:smallCaps w:val="false"/>
           <w:color w:val="000000"/>
@@ -12497,7 +12360,6 @@
           <w:rFonts w:ascii="rem;Google Sans Text;Google Sans;sans-serif" w:hAnsi="rem;Google Sans Text;Google Sans;sans-serif"/>
           <w:b w:val="false"/>
           <w:bCs w:val="false"/>
-          <w:i w:val="false"/>
           <w:i w:val="false"/>
           <w:caps w:val="false"/>
           <w:smallCaps w:val="false"/>
@@ -12704,7 +12566,6 @@
           <w:b w:val="false"/>
           <w:bCs w:val="false"/>
           <w:i w:val="false"/>
-          <w:i w:val="false"/>
           <w:caps w:val="false"/>
           <w:smallCaps w:val="false"/>
           <w:color w:val="000000"/>
@@ -12752,21 +12613,18 @@
           <w:spacing w:val="0"/>
         </w:rPr>
         <w:tab/>
-        <w:t xml:space="preserve">• </w:t>
-      </w:r>
-      <w:r>
-        <w:rPr>
-          <w:rFonts w:ascii="rem;Google Sans Text;Google Sans;sans-serif" w:hAnsi="rem;Google Sans Text;Google Sans;sans-serif"/>
-          <w:b w:val="false"/>
-          <w:bCs w:val="false"/>
-          <w:i w:val="false"/>
-          <w:caps w:val="false"/>
-          <w:smallCaps w:val="false"/>
-          <w:color w:val="000000"/>
-          <w:spacing w:val="0"/>
-          <w:sz w:val="21"/>
-        </w:rPr>
-        <w:t xml:space="preserve">To LinkReset, Disabled, or LinkError: Triggered by the Adapter, internal PHY events, </w:t>
+        <w:t>•</w:t>
+      </w:r>
+      <w:r>
+        <w:rPr>
+          <w:b w:val="false"/>
+          <w:bCs w:val="false"/>
+          <w:caps w:val="false"/>
+          <w:smallCaps w:val="false"/>
+          <w:color w:val="000000"/>
+          <w:spacing w:val="0"/>
+        </w:rPr>
+        <w:t>To Active.PMNAK: occurs if the partner replies with {RDI.LinkMgmt.PMNAK.Resp} when</w:t>
       </w:r>
     </w:p>
     <w:p>
@@ -12787,20 +12645,15 @@
       </w:pPr>
       <w:r>
         <w:rPr>
-          <w:rFonts w:ascii="rem;Google Sans Text;Google Sans;sans-serif" w:hAnsi="rem;Google Sans Text;Google Sans;sans-serif"/>
-          <w:b w:val="false"/>
-          <w:bCs w:val="false"/>
-          <w:i w:val="false"/>
-          <w:caps w:val="false"/>
-          <w:smallCaps w:val="false"/>
-          <w:color w:val="000000"/>
-          <w:spacing w:val="0"/>
-          <w:sz w:val="21"/>
-        </w:rPr>
-        <w:tab/>
-        <w:t xml:space="preserve">or remote partner requests. These transitions (except LinkError) require the completion of a </w:t>
-        <w:tab/>
-        <w:t>Stallreq/Ack handshake to ensure data is stopped at a clean boundary.</w:t>
+          <w:b w:val="false"/>
+          <w:bCs w:val="false"/>
+          <w:caps w:val="false"/>
+          <w:smallCaps w:val="false"/>
+          <w:color w:val="000000"/>
+          <w:spacing w:val="0"/>
+        </w:rPr>
+        <w:tab/>
+        <w:t>requesting PM entry.</w:t>
       </w:r>
     </w:p>
     <w:p>
@@ -12811,17 +12664,22 @@
         <w:ind w:hanging="0" w:left="0" w:right="0"/>
         <w:jc w:val="left"/>
         <w:rPr>
-          <w:rFonts w:ascii="rem;Google Sans Text;Google Sans;sans-serif" w:hAnsi="rem;Google Sans Text;Google Sans;sans-serif"/>
-          <w:i w:val="false"/>
-          <w:i w:val="false"/>
-          <w:sz w:val="21"/>
-        </w:rPr>
-      </w:pPr>
-      <w:r>
-        <w:rPr>
-          <w:rFonts w:ascii="rem;Google Sans Text;Google Sans;sans-serif" w:hAnsi="rem;Google Sans Text;Google Sans;sans-serif"/>
-          <w:i w:val="false"/>
-          <w:sz w:val="21"/>
+          <w:b w:val="false"/>
+          <w:bCs w:val="false"/>
+          <w:caps w:val="false"/>
+          <w:smallCaps w:val="false"/>
+          <w:color w:val="000000"/>
+          <w:spacing w:val="0"/>
+        </w:rPr>
+      </w:pPr>
+      <w:r>
+        <w:rPr>
+          <w:b w:val="false"/>
+          <w:bCs w:val="false"/>
+          <w:caps w:val="false"/>
+          <w:smallCaps w:val="false"/>
+          <w:color w:val="000000"/>
+          <w:spacing w:val="0"/>
         </w:rPr>
       </w:r>
     </w:p>
@@ -12833,18 +12691,50 @@
         <w:ind w:hanging="0" w:left="0" w:right="0"/>
         <w:jc w:val="left"/>
         <w:rPr>
-          <w:rFonts w:ascii="rem;Google Sans Text;Google Sans;sans-serif" w:hAnsi="rem;Google Sans Text;Google Sans;sans-serif"/>
-          <w:i w:val="false"/>
-          <w:i w:val="false"/>
-          <w:sz w:val="21"/>
-        </w:rPr>
-      </w:pPr>
-      <w:r>
-        <w:rPr>
-          <w:rFonts w:ascii="rem;Google Sans Text;Google Sans;sans-serif" w:hAnsi="rem;Google Sans Text;Google Sans;sans-serif"/>
-          <w:i w:val="false"/>
-          <w:sz w:val="21"/>
-        </w:rPr>
+          <w:b w:val="false"/>
+          <w:bCs w:val="false"/>
+          <w:caps w:val="false"/>
+          <w:smallCaps w:val="false"/>
+          <w:color w:val="000000"/>
+          <w:spacing w:val="0"/>
+        </w:rPr>
+      </w:pPr>
+      <w:r>
+        <w:rPr>
+          <w:b w:val="false"/>
+          <w:bCs w:val="false"/>
+          <w:caps w:val="false"/>
+          <w:smallCaps w:val="false"/>
+          <w:color w:val="000000"/>
+          <w:spacing w:val="0"/>
+        </w:rPr>
+        <w:tab/>
+        <w:t>•</w:t>
+      </w:r>
+      <w:r>
+        <w:rPr>
+          <w:b w:val="false"/>
+          <w:bCs w:val="false"/>
+          <w:caps w:val="false"/>
+          <w:smallCaps w:val="false"/>
+          <w:color w:val="000000"/>
+          <w:spacing w:val="0"/>
+        </w:rPr>
+        <w:t xml:space="preserve"> </w:t>
+      </w:r>
+      <w:r>
+        <w:rPr>
+          <w:rFonts w:ascii="rem;Google Sans Text;Google Sans;sans-serif" w:hAnsi="rem;Google Sans Text;Google Sans;sans-serif"/>
+          <w:b w:val="false"/>
+          <w:bCs w:val="false"/>
+          <w:i w:val="false"/>
+          <w:caps w:val="false"/>
+          <w:smallCaps w:val="false"/>
+          <w:color w:val="000000"/>
+          <w:spacing w:val="0"/>
+          <w:sz w:val="21"/>
+        </w:rPr>
+        <w:t xml:space="preserve">To LinkReset, Disabled, or LinkError: Triggered by the Adapter, internal PHY events, </w:t>
       </w:r>
     </w:p>
     <w:p>
@@ -12855,8 +12745,45 @@
         <w:ind w:hanging="0" w:left="0" w:right="0"/>
         <w:jc w:val="left"/>
         <w:rPr>
-          <w:rFonts w:ascii="rem;Google Sans Text;Google Sans;sans-serif" w:hAnsi="rem;Google Sans Text;Google Sans;sans-serif"/>
-          <w:i w:val="false"/>
+          <w:b w:val="false"/>
+          <w:bCs w:val="false"/>
+          <w:caps w:val="false"/>
+          <w:smallCaps w:val="false"/>
+          <w:color w:val="000000"/>
+          <w:spacing w:val="0"/>
+        </w:rPr>
+      </w:pPr>
+      <w:r>
+        <w:rPr>
+          <w:rFonts w:ascii="rem;Google Sans Text;Google Sans;sans-serif" w:hAnsi="rem;Google Sans Text;Google Sans;sans-serif"/>
+          <w:b w:val="false"/>
+          <w:bCs w:val="false"/>
+          <w:i w:val="false"/>
+          <w:caps w:val="false"/>
+          <w:smallCaps w:val="false"/>
+          <w:color w:val="000000"/>
+          <w:spacing w:val="0"/>
+          <w:sz w:val="21"/>
+        </w:rPr>
+        <w:tab/>
+        <w:t xml:space="preserve">or remote partner requests. These transitions (except LinkError) require the completion of a </w:t>
+        <w:tab/>
+        <w:t>Stallreq/Ack handshake to ensure data is stopped at a clean boundary.</w:t>
+      </w:r>
+    </w:p>
+    <w:p>
+      <w:pPr>
+        <w:pStyle w:val="Normal"/>
+        <w:numPr>
+          <w:ilvl w:val="0"/>
+          <w:numId w:val="0"/>
+        </w:numPr>
+        <w:bidi w:val="0"/>
+        <w:spacing w:lineRule="auto" w:line="360"/>
+        <w:ind w:hanging="0" w:left="1440"/>
+        <w:jc w:val="left"/>
+        <w:rPr>
+          <w:rFonts w:ascii="rem;Google Sans Text;Google Sans;sans-serif" w:hAnsi="rem;Google Sans Text;Google Sans;sans-serif"/>
           <w:i w:val="false"/>
           <w:sz w:val="21"/>
         </w:rPr>
@@ -12879,7 +12806,6 @@
         <w:rPr>
           <w:rFonts w:ascii="rem;Google Sans Text;Google Sans;sans-serif" w:hAnsi="rem;Google Sans Text;Google Sans;sans-serif"/>
           <w:i w:val="false"/>
-          <w:i w:val="false"/>
           <w:sz w:val="21"/>
         </w:rPr>
       </w:pPr>
@@ -12900,30 +12826,16 @@
         <w:jc w:val="left"/>
         <w:rPr>
           <w:rFonts w:ascii="rem;Google Sans Text;Google Sans;sans-serif" w:hAnsi="rem;Google Sans Text;Google Sans;sans-serif"/>
-          <w:b w:val="false"/>
-          <w:bCs w:val="false"/>
-          <w:i w:val="false"/>
-          <w:i w:val="false"/>
-          <w:caps w:val="false"/>
-          <w:smallCaps w:val="false"/>
-          <w:color w:val="000000"/>
-          <w:spacing w:val="0"/>
-          <w:sz w:val="21"/>
-        </w:rPr>
-      </w:pPr>
-      <w:r>
-        <w:rPr>
-          <w:rFonts w:ascii="rem;Google Sans Text;Google Sans;sans-serif" w:hAnsi="rem;Google Sans Text;Google Sans;sans-serif"/>
-          <w:b w:val="false"/>
-          <w:bCs w:val="false"/>
-          <w:i w:val="false"/>
-          <w:caps w:val="false"/>
-          <w:smallCaps w:val="false"/>
-          <w:color w:val="000000"/>
-          <w:spacing w:val="0"/>
-          <w:sz w:val="21"/>
-        </w:rPr>
-        <w:t>3. Active.PMNAK sub-State</w:t>
+          <w:i w:val="false"/>
+          <w:sz w:val="21"/>
+        </w:rPr>
+      </w:pPr>
+      <w:r>
+        <w:rPr>
+          <w:rFonts w:ascii="rem;Google Sans Text;Google Sans;sans-serif" w:hAnsi="rem;Google Sans Text;Google Sans;sans-serif"/>
+          <w:i w:val="false"/>
+          <w:sz w:val="21"/>
+        </w:rPr>
       </w:r>
     </w:p>
     <w:p>
@@ -12934,39 +12846,17 @@
         <w:ind w:hanging="0" w:left="0" w:right="0"/>
         <w:jc w:val="left"/>
         <w:rPr>
-          <w:b w:val="false"/>
-          <w:bCs w:val="false"/>
-          <w:caps w:val="false"/>
-          <w:smallCaps w:val="false"/>
-          <w:color w:val="000000"/>
-          <w:spacing w:val="0"/>
-        </w:rPr>
-      </w:pPr>
-      <w:r>
-        <w:rPr>
-          <w:b w:val="false"/>
-          <w:bCs w:val="false"/>
-          <w:caps w:val="false"/>
-          <w:smallCaps w:val="false"/>
-          <w:color w:val="000000"/>
-          <w:spacing w:val="0"/>
-        </w:rPr>
-        <w:tab/>
-        <w:t xml:space="preserve">• </w:t>
-      </w:r>
-      <w:r>
-        <w:rPr>
-          <w:rFonts w:ascii="rem;Google Sans Text;Google Sans;sans-serif" w:hAnsi="rem;Google Sans Text;Google Sans;sans-serif"/>
-          <w:b w:val="false"/>
-          <w:bCs w:val="false"/>
-          <w:i w:val="false"/>
-          <w:caps w:val="false"/>
-          <w:smallCaps w:val="false"/>
-          <w:color w:val="000000"/>
-          <w:spacing w:val="0"/>
-          <w:sz w:val="21"/>
-        </w:rPr>
-        <w:t>To Active: The Adapter must initiate an Active request on the RDI.</w:t>
+          <w:rFonts w:ascii="rem;Google Sans Text;Google Sans;sans-serif" w:hAnsi="rem;Google Sans Text;Google Sans;sans-serif"/>
+          <w:i w:val="false"/>
+          <w:sz w:val="21"/>
+        </w:rPr>
+      </w:pPr>
+      <w:r>
+        <w:rPr>
+          <w:rFonts w:ascii="rem;Google Sans Text;Google Sans;sans-serif" w:hAnsi="rem;Google Sans Text;Google Sans;sans-serif"/>
+          <w:i w:val="false"/>
+          <w:sz w:val="21"/>
+        </w:rPr>
       </w:r>
     </w:p>
     <w:p>
@@ -12977,23 +12867,30 @@
         <w:ind w:hanging="0" w:left="0" w:right="0"/>
         <w:jc w:val="left"/>
         <w:rPr>
-          <w:b w:val="false"/>
-          <w:bCs w:val="false"/>
-          <w:caps w:val="false"/>
-          <w:smallCaps w:val="false"/>
-          <w:color w:val="000000"/>
-          <w:spacing w:val="0"/>
-        </w:rPr>
-      </w:pPr>
-      <w:r>
-        <w:rPr>
-          <w:b w:val="false"/>
-          <w:bCs w:val="false"/>
-          <w:caps w:val="false"/>
-          <w:smallCaps w:val="false"/>
-          <w:color w:val="000000"/>
-          <w:spacing w:val="0"/>
-        </w:rPr>
+          <w:rFonts w:ascii="rem;Google Sans Text;Google Sans;sans-serif" w:hAnsi="rem;Google Sans Text;Google Sans;sans-serif"/>
+          <w:b w:val="false"/>
+          <w:bCs w:val="false"/>
+          <w:i w:val="false"/>
+          <w:caps w:val="false"/>
+          <w:smallCaps w:val="false"/>
+          <w:color w:val="000000"/>
+          <w:spacing w:val="0"/>
+          <w:sz w:val="21"/>
+        </w:rPr>
+      </w:pPr>
+      <w:r>
+        <w:rPr>
+          <w:rFonts w:ascii="rem;Google Sans Text;Google Sans;sans-serif" w:hAnsi="rem;Google Sans Text;Google Sans;sans-serif"/>
+          <w:b w:val="false"/>
+          <w:bCs w:val="false"/>
+          <w:i w:val="false"/>
+          <w:caps w:val="false"/>
+          <w:smallCaps w:val="false"/>
+          <w:color w:val="000000"/>
+          <w:spacing w:val="0"/>
+          <w:sz w:val="21"/>
+        </w:rPr>
+        <w:t>3. Active.PMNAK sub-State</w:t>
       </w:r>
     </w:p>
     <w:p>
@@ -13036,11 +12933,7 @@
           <w:spacing w:val="0"/>
           <w:sz w:val="21"/>
         </w:rPr>
-        <w:t xml:space="preserve">To Retrain, LinkReset, Disabled, or LinkError: These are triggered by link events or </w:t>
-        <w:tab/>
-        <w:tab/>
-        <w:tab/>
-        <w:t>remote requests while the interface wants for the Adapter to return to Active.</w:t>
+        <w:t>To Active: The Adapter must initiate an Active request on the RDI.</w:t>
       </w:r>
     </w:p>
     <w:p>
@@ -13051,10 +12944,83 @@
         <w:ind w:hanging="0" w:left="0" w:right="0"/>
         <w:jc w:val="left"/>
         <w:rPr>
-          <w:rFonts w:ascii="rem;Google Sans Text;Google Sans;sans-serif" w:hAnsi="rem;Google Sans Text;Google Sans;sans-serif"/>
-          <w:b w:val="false"/>
-          <w:bCs w:val="false"/>
-          <w:i w:val="false"/>
+          <w:b w:val="false"/>
+          <w:bCs w:val="false"/>
+          <w:caps w:val="false"/>
+          <w:smallCaps w:val="false"/>
+          <w:color w:val="000000"/>
+          <w:spacing w:val="0"/>
+        </w:rPr>
+      </w:pPr>
+      <w:r>
+        <w:rPr>
+          <w:b w:val="false"/>
+          <w:bCs w:val="false"/>
+          <w:caps w:val="false"/>
+          <w:smallCaps w:val="false"/>
+          <w:color w:val="000000"/>
+          <w:spacing w:val="0"/>
+        </w:rPr>
+      </w:r>
+    </w:p>
+    <w:p>
+      <w:pPr>
+        <w:pStyle w:val="Normal"/>
+        <w:bidi w:val="0"/>
+        <w:spacing w:lineRule="auto" w:line="360"/>
+        <w:ind w:hanging="0" w:left="0" w:right="0"/>
+        <w:jc w:val="left"/>
+        <w:rPr>
+          <w:b w:val="false"/>
+          <w:bCs w:val="false"/>
+          <w:caps w:val="false"/>
+          <w:smallCaps w:val="false"/>
+          <w:color w:val="000000"/>
+          <w:spacing w:val="0"/>
+        </w:rPr>
+      </w:pPr>
+      <w:r>
+        <w:rPr>
+          <w:b w:val="false"/>
+          <w:bCs w:val="false"/>
+          <w:caps w:val="false"/>
+          <w:smallCaps w:val="false"/>
+          <w:color w:val="000000"/>
+          <w:spacing w:val="0"/>
+        </w:rPr>
+        <w:tab/>
+        <w:t xml:space="preserve">• </w:t>
+      </w:r>
+      <w:r>
+        <w:rPr>
+          <w:rFonts w:ascii="rem;Google Sans Text;Google Sans;sans-serif" w:hAnsi="rem;Google Sans Text;Google Sans;sans-serif"/>
+          <w:b w:val="false"/>
+          <w:bCs w:val="false"/>
+          <w:i w:val="false"/>
+          <w:caps w:val="false"/>
+          <w:smallCaps w:val="false"/>
+          <w:color w:val="000000"/>
+          <w:spacing w:val="0"/>
+          <w:sz w:val="21"/>
+        </w:rPr>
+        <w:t xml:space="preserve">To Retrain, LinkReset, Disabled, or LinkError: These are triggered by link events or </w:t>
+        <w:tab/>
+        <w:tab/>
+        <w:tab/>
+        <w:t>remote requests while the interface wants for the Adapter to return to Active.</w:t>
+      </w:r>
+    </w:p>
+    <w:p>
+      <w:pPr>
+        <w:pStyle w:val="Normal"/>
+        <w:bidi w:val="0"/>
+        <w:spacing w:lineRule="auto" w:line="360"/>
+        <w:ind w:hanging="0" w:left="0" w:right="0"/>
+        <w:jc w:val="left"/>
+        <w:rPr>
+          <w:rFonts w:ascii="rem;Google Sans Text;Google Sans;sans-serif" w:hAnsi="rem;Google Sans Text;Google Sans;sans-serif"/>
+          <w:b w:val="false"/>
+          <w:bCs w:val="false"/>
           <w:i w:val="false"/>
           <w:caps w:val="false"/>
           <w:smallCaps w:val="false"/>
@@ -13408,7 +13374,6 @@
         <w:rPr>
           <w:rFonts w:ascii="rem;Google Sans Text;Google Sans;sans-serif" w:hAnsi="rem;Google Sans Text;Google Sans;sans-serif"/>
           <w:i w:val="false"/>
-          <w:i w:val="false"/>
           <w:sz w:val="21"/>
         </w:rPr>
       </w:pPr>
@@ -13432,7 +13397,6 @@
           <w:b w:val="false"/>
           <w:bCs w:val="false"/>
           <w:i w:val="false"/>
-          <w:i w:val="false"/>
           <w:caps w:val="false"/>
           <w:smallCaps w:val="false"/>
           <w:color w:val="000000"/>
@@ -13543,7 +13507,6 @@
           <w:b w:val="false"/>
           <w:bCs w:val="false"/>
           <w:i w:val="false"/>
-          <w:i w:val="false"/>
           <w:caps w:val="false"/>
           <w:smallCaps w:val="false"/>
           <w:color w:val="000000"/>
@@ -13653,7 +13616,6 @@
           <w:rFonts w:ascii="rem;Google Sans Text;Google Sans;sans-serif" w:hAnsi="rem;Google Sans Text;Google Sans;sans-serif"/>
           <w:b w:val="false"/>
           <w:bCs w:val="false"/>
-          <w:i w:val="false"/>
           <w:i w:val="false"/>
           <w:caps w:val="false"/>
           <w:smallCaps w:val="false"/>
@@ -13976,7 +13938,6 @@
           <w:b w:val="false"/>
           <w:bCs w:val="false"/>
           <w:i w:val="false"/>
-          <w:i w:val="false"/>
           <w:caps w:val="false"/>
           <w:smallCaps w:val="false"/>
           <w:color w:val="000000"/>
@@ -14010,7 +13971,6 @@
           <w:b w:val="false"/>
           <w:bCs w:val="false"/>
           <w:i w:val="false"/>
-          <w:i w:val="false"/>
           <w:caps w:val="false"/>
           <w:smallCaps w:val="false"/>
           <w:color w:val="000000"/>
@@ -14044,7 +14004,6 @@
           <w:b w:val="false"/>
           <w:bCs w:val="false"/>
           <w:i w:val="false"/>
-          <w:i w:val="false"/>
           <w:caps w:val="false"/>
           <w:smallCaps w:val="false"/>
           <w:color w:val="000000"/>
@@ -14078,7 +14037,6 @@
           <w:b w:val="false"/>
           <w:bCs w:val="false"/>
           <w:i w:val="false"/>
-          <w:i w:val="false"/>
           <w:caps w:val="false"/>
           <w:smallCaps w:val="false"/>
           <w:color w:val="000000"/>
@@ -14250,7 +14208,6 @@
           <w:b w:val="false"/>
           <w:bCs w:val="false"/>
           <w:i w:val="false"/>
-          <w:i w:val="false"/>
           <w:caps w:val="false"/>
           <w:smallCaps w:val="false"/>
           <w:color w:val="000000"/>
@@ -14476,7 +14433,6 @@
         <w:rPr>
           <w:rFonts w:ascii="rem;Google Sans Text;Google Sans;sans-serif" w:hAnsi="rem;Google Sans Text;Google Sans;sans-serif"/>
           <w:i w:val="false"/>
-          <w:i w:val="false"/>
           <w:caps w:val="false"/>
           <w:smallCaps w:val="false"/>
           <w:spacing w:val="0"/>
@@ -14516,7 +14472,7 @@
           <w:szCs w:val="32"/>
         </w:rPr>
         <w:drawing>
-          <wp:anchor behindDoc="0" distT="0" distB="0" distL="0" distR="0" simplePos="0" locked="0" layoutInCell="0" allowOverlap="1" relativeHeight="6">
+          <wp:anchor distT="0" distB="0" distL="0" distR="0" simplePos="0" relativeHeight="6" behindDoc="0" locked="0" layoutInCell="0" allowOverlap="1">
             <wp:simplePos x="0" y="0"/>
             <wp:positionH relativeFrom="column">
               <wp:align>center</wp:align>
@@ -14527,7 +14483,7 @@
             <wp:extent cx="6120130" cy="3804920"/>
             <wp:effectExtent l="0" t="0" r="0" b="0"/>
             <wp:wrapSquare wrapText="largest"/>
-            <wp:docPr id="6" name="Image1 Copy 1" descr=""/>
+            <wp:docPr id="6" name="Image1 Copy 1"/>
             <wp:cNvGraphicFramePr>
               <a:graphicFrameLocks xmlns:a="http://schemas.openxmlformats.org/drawingml/2006/main" noChangeAspect="1"/>
             </wp:cNvGraphicFramePr>
@@ -14535,7 +14491,7 @@
               <a:graphicData uri="http://schemas.openxmlformats.org/drawingml/2006/picture">
                 <pic:pic xmlns:pic="http://schemas.openxmlformats.org/drawingml/2006/picture">
                   <pic:nvPicPr>
-                    <pic:cNvPr id="6" name="Image1 Copy 1" descr=""/>
+                    <pic:cNvPr id="6" name="Image1 Copy 1"/>
                     <pic:cNvPicPr>
                       <a:picLocks noChangeAspect="1" noChangeArrowheads="1"/>
                     </pic:cNvPicPr>
@@ -14554,6 +14510,7 @@
                     <a:prstGeom prst="rect">
                       <a:avLst/>
                     </a:prstGeom>
+                    <a:noFill/>
                   </pic:spPr>
                 </pic:pic>
               </a:graphicData>
@@ -14594,7 +14551,6 @@
           <w:rFonts w:ascii="rem;Google Sans Text;Google Sans;sans-serif" w:hAnsi="rem;Google Sans Text;Google Sans;sans-serif"/>
           <w:b/>
           <w:i w:val="false"/>
-          <w:i w:val="false"/>
           <w:caps w:val="false"/>
           <w:smallCaps w:val="false"/>
           <w:spacing w:val="0"/>
@@ -14624,7 +14580,6 @@
           <w:rFonts w:ascii="rem;Google Sans Text;Google Sans;sans-serif" w:hAnsi="rem;Google Sans Text;Google Sans;sans-serif"/>
           <w:b/>
           <w:i w:val="false"/>
-          <w:i w:val="false"/>
           <w:caps w:val="false"/>
           <w:smallCaps w:val="false"/>
           <w:spacing w:val="0"/>
@@ -14654,7 +14609,6 @@
           <w:rFonts w:ascii="rem;Google Sans Text;Google Sans;sans-serif" w:hAnsi="rem;Google Sans Text;Google Sans;sans-serif"/>
           <w:b/>
           <w:i w:val="false"/>
-          <w:i w:val="false"/>
           <w:caps w:val="false"/>
           <w:smallCaps w:val="false"/>
           <w:spacing w:val="0"/>
@@ -14684,7 +14638,6 @@
           <w:rFonts w:ascii="rem;Google Sans Text;Google Sans;sans-serif" w:hAnsi="rem;Google Sans Text;Google Sans;sans-serif"/>
           <w:b/>
           <w:i w:val="false"/>
-          <w:i w:val="false"/>
           <w:caps w:val="false"/>
           <w:smallCaps w:val="false"/>
           <w:spacing w:val="0"/>
@@ -14714,7 +14667,6 @@
           <w:rFonts w:ascii="rem;Google Sans Text;Google Sans;sans-serif" w:hAnsi="rem;Google Sans Text;Google Sans;sans-serif"/>
           <w:b/>
           <w:i w:val="false"/>
-          <w:i w:val="false"/>
           <w:caps w:val="false"/>
           <w:smallCaps w:val="false"/>
           <w:spacing w:val="0"/>
@@ -14744,7 +14696,6 @@
           <w:rFonts w:ascii="rem;Google Sans Text;Google Sans;sans-serif" w:hAnsi="rem;Google Sans Text;Google Sans;sans-serif"/>
           <w:b/>
           <w:i w:val="false"/>
-          <w:i w:val="false"/>
           <w:caps w:val="false"/>
           <w:smallCaps w:val="false"/>
           <w:spacing w:val="0"/>
@@ -14774,7 +14725,6 @@
           <w:rFonts w:ascii="rem;Google Sans Text;Google Sans;sans-serif" w:hAnsi="rem;Google Sans Text;Google Sans;sans-serif"/>
           <w:b/>
           <w:i w:val="false"/>
-          <w:i w:val="false"/>
           <w:caps w:val="false"/>
           <w:smallCaps w:val="false"/>
           <w:spacing w:val="0"/>
@@ -14804,7 +14754,6 @@
           <w:rFonts w:ascii="rem;Google Sans Text;Google Sans;sans-serif" w:hAnsi="rem;Google Sans Text;Google Sans;sans-serif"/>
           <w:b/>
           <w:i w:val="false"/>
-          <w:i w:val="false"/>
           <w:caps w:val="false"/>
           <w:smallCaps w:val="false"/>
           <w:spacing w:val="0"/>
@@ -14834,7 +14783,6 @@
           <w:rFonts w:ascii="rem;Google Sans Text;Google Sans;sans-serif" w:hAnsi="rem;Google Sans Text;Google Sans;sans-serif"/>
           <w:b/>
           <w:i w:val="false"/>
-          <w:i w:val="false"/>
           <w:caps w:val="false"/>
           <w:smallCaps w:val="false"/>
           <w:spacing w:val="0"/>
@@ -14864,7 +14812,6 @@
           <w:rFonts w:ascii="rem;Google Sans Text;Google Sans;sans-serif" w:hAnsi="rem;Google Sans Text;Google Sans;sans-serif"/>
           <w:b/>
           <w:i w:val="false"/>
-          <w:i w:val="false"/>
           <w:caps w:val="false"/>
           <w:smallCaps w:val="false"/>
           <w:spacing w:val="0"/>
@@ -14894,7 +14841,6 @@
           <w:rFonts w:ascii="rem;Google Sans Text;Google Sans;sans-serif" w:hAnsi="rem;Google Sans Text;Google Sans;sans-serif"/>
           <w:b/>
           <w:i w:val="false"/>
-          <w:i w:val="false"/>
           <w:caps w:val="false"/>
           <w:smallCaps w:val="false"/>
           <w:spacing w:val="0"/>
@@ -14924,7 +14870,6 @@
           <w:rFonts w:ascii="rem;Google Sans Text;Google Sans;sans-serif" w:hAnsi="rem;Google Sans Text;Google Sans;sans-serif"/>
           <w:b/>
           <w:i w:val="false"/>
-          <w:i w:val="false"/>
           <w:caps w:val="false"/>
           <w:smallCaps w:val="false"/>
           <w:spacing w:val="0"/>
@@ -14954,7 +14899,6 @@
           <w:rFonts w:ascii="rem;Google Sans Text;Google Sans;sans-serif" w:hAnsi="rem;Google Sans Text;Google Sans;sans-serif"/>
           <w:b/>
           <w:i w:val="false"/>
-          <w:i w:val="false"/>
           <w:caps w:val="false"/>
           <w:smallCaps w:val="false"/>
           <w:spacing w:val="0"/>
@@ -14983,7 +14927,6 @@
         <w:rPr>
           <w:rFonts w:ascii="rem;Google Sans Text;Google Sans;sans-serif" w:hAnsi="rem;Google Sans Text;Google Sans;sans-serif"/>
           <w:b/>
-          <w:i w:val="false"/>
           <w:i w:val="false"/>
           <w:caps w:val="false"/>
           <w:smallCaps w:val="false"/>
@@ -15023,7 +14966,7 @@
         <w:gridCol w:w="3177"/>
         <w:gridCol w:w="1255"/>
         <w:gridCol w:w="900"/>
-        <w:gridCol w:w="5222"/>
+        <w:gridCol w:w="5223"/>
       </w:tblGrid>
       <w:tr>
         <w:trPr/>
@@ -15157,7 +15100,7 @@
         </w:tc>
         <w:tc>
           <w:tcPr>
-            <w:tcW w:w="5222" w:type="dxa"/>
+            <w:tcW w:w="5223" w:type="dxa"/>
             <w:tcBorders>
               <w:top w:val="single" w:sz="8" w:space="0" w:color="000000"/>
               <w:left w:val="single" w:sz="8" w:space="0" w:color="000000"/>
@@ -15331,7 +15274,7 @@
         </w:tc>
         <w:tc>
           <w:tcPr>
-            <w:tcW w:w="5222" w:type="dxa"/>
+            <w:tcW w:w="5223" w:type="dxa"/>
             <w:tcBorders>
               <w:top w:val="single" w:sz="8" w:space="0" w:color="000000"/>
               <w:left w:val="single" w:sz="8" w:space="0" w:color="000000"/>
@@ -15502,7 +15445,7 @@
         </w:tc>
         <w:tc>
           <w:tcPr>
-            <w:tcW w:w="5222" w:type="dxa"/>
+            <w:tcW w:w="5223" w:type="dxa"/>
             <w:tcBorders>
               <w:left w:val="single" w:sz="8" w:space="0" w:color="000000"/>
               <w:bottom w:val="single" w:sz="8" w:space="0" w:color="000000"/>
@@ -15672,7 +15615,7 @@
         </w:tc>
         <w:tc>
           <w:tcPr>
-            <w:tcW w:w="5222" w:type="dxa"/>
+            <w:tcW w:w="5223" w:type="dxa"/>
             <w:tcBorders>
               <w:left w:val="single" w:sz="8" w:space="0" w:color="000000"/>
               <w:bottom w:val="single" w:sz="8" w:space="0" w:color="000000"/>
@@ -15734,7 +15677,6 @@
                 <w:rFonts w:ascii="Helvetica" w:hAnsi="Helvetica"/>
                 <w:b w:val="false"/>
                 <w:i w:val="false"/>
-                <w:i w:val="false"/>
                 <w:caps w:val="false"/>
                 <w:smallCaps w:val="false"/>
                 <w:color w:val="000000"/>
@@ -15851,7 +15793,7 @@
         </w:tc>
         <w:tc>
           <w:tcPr>
-            <w:tcW w:w="5222" w:type="dxa"/>
+            <w:tcW w:w="5223" w:type="dxa"/>
             <w:tcBorders>
               <w:left w:val="single" w:sz="8" w:space="0" w:color="000000"/>
               <w:bottom w:val="single" w:sz="8" w:space="0" w:color="000000"/>
@@ -15994,7 +15936,6 @@
                 <w:b w:val="false"/>
                 <w:bCs w:val="false"/>
                 <w:i w:val="false"/>
-                <w:i w:val="false"/>
                 <w:caps w:val="false"/>
                 <w:smallCaps w:val="false"/>
                 <w:strike w:val="false"/>
@@ -16030,7 +15971,7 @@
         </w:tc>
         <w:tc>
           <w:tcPr>
-            <w:tcW w:w="5222" w:type="dxa"/>
+            <w:tcW w:w="5223" w:type="dxa"/>
             <w:tcBorders>
               <w:left w:val="single" w:sz="8" w:space="0" w:color="000000"/>
               <w:bottom w:val="single" w:sz="8" w:space="0" w:color="000000"/>
@@ -16094,7 +16035,6 @@
                 <w:b w:val="false"/>
                 <w:bCs w:val="false"/>
                 <w:i w:val="false"/>
-                <w:i w:val="false"/>
                 <w:caps w:val="false"/>
                 <w:smallCaps w:val="false"/>
                 <w:strike w:val="false"/>
@@ -16181,7 +16121,6 @@
                 <w:b w:val="false"/>
                 <w:bCs w:val="false"/>
                 <w:i w:val="false"/>
-                <w:i w:val="false"/>
                 <w:caps w:val="false"/>
                 <w:smallCaps w:val="false"/>
                 <w:strike w:val="false"/>
@@ -16217,7 +16156,7 @@
         </w:tc>
         <w:tc>
           <w:tcPr>
-            <w:tcW w:w="5222" w:type="dxa"/>
+            <w:tcW w:w="5223" w:type="dxa"/>
             <w:tcBorders>
               <w:left w:val="single" w:sz="8" w:space="0" w:color="000000"/>
               <w:bottom w:val="single" w:sz="8" w:space="0" w:color="000000"/>
@@ -16235,7 +16174,6 @@
                 <w:rFonts w:ascii="Arial;sans-serif" w:hAnsi="Arial;sans-serif"/>
                 <w:b w:val="false"/>
                 <w:bCs w:val="false"/>
-                <w:i w:val="false"/>
                 <w:i w:val="false"/>
                 <w:caps w:val="false"/>
                 <w:smallCaps w:val="false"/>
@@ -16293,7 +16231,6 @@
                 <w:b w:val="false"/>
                 <w:bCs w:val="false"/>
                 <w:i w:val="false"/>
-                <w:i w:val="false"/>
                 <w:caps w:val="false"/>
                 <w:smallCaps w:val="false"/>
                 <w:strike w:val="false"/>
@@ -16380,7 +16317,6 @@
                 <w:b w:val="false"/>
                 <w:bCs w:val="false"/>
                 <w:i w:val="false"/>
-                <w:i w:val="false"/>
                 <w:caps w:val="false"/>
                 <w:smallCaps w:val="false"/>
                 <w:strike w:val="false"/>
@@ -16416,7 +16352,7 @@
         </w:tc>
         <w:tc>
           <w:tcPr>
-            <w:tcW w:w="5222" w:type="dxa"/>
+            <w:tcW w:w="5223" w:type="dxa"/>
             <w:tcBorders>
               <w:left w:val="single" w:sz="8" w:space="0" w:color="000000"/>
               <w:bottom w:val="single" w:sz="8" w:space="0" w:color="000000"/>
@@ -16434,7 +16370,6 @@
                 <w:rFonts w:ascii="Arial;sans-serif" w:hAnsi="Arial;sans-serif"/>
                 <w:b w:val="false"/>
                 <w:bCs w:val="false"/>
-                <w:i w:val="false"/>
                 <w:i w:val="false"/>
                 <w:caps w:val="false"/>
                 <w:smallCaps w:val="false"/>
@@ -16492,7 +16427,6 @@
                 <w:b w:val="false"/>
                 <w:bCs w:val="false"/>
                 <w:i w:val="false"/>
-                <w:i w:val="false"/>
                 <w:caps w:val="false"/>
                 <w:smallCaps w:val="false"/>
                 <w:strike w:val="false"/>
@@ -16579,7 +16513,6 @@
                 <w:b w:val="false"/>
                 <w:bCs w:val="false"/>
                 <w:i w:val="false"/>
-                <w:i w:val="false"/>
                 <w:caps w:val="false"/>
                 <w:smallCaps w:val="false"/>
                 <w:strike w:val="false"/>
@@ -16615,7 +16548,7 @@
         </w:tc>
         <w:tc>
           <w:tcPr>
-            <w:tcW w:w="5222" w:type="dxa"/>
+            <w:tcW w:w="5223" w:type="dxa"/>
             <w:tcBorders>
               <w:left w:val="single" w:sz="8" w:space="0" w:color="000000"/>
               <w:bottom w:val="single" w:sz="8" w:space="0" w:color="000000"/>
@@ -16633,7 +16566,6 @@
                 <w:rFonts w:ascii="Arial;sans-serif" w:hAnsi="Arial;sans-serif"/>
                 <w:b w:val="false"/>
                 <w:bCs w:val="false"/>
-                <w:i w:val="false"/>
                 <w:i w:val="false"/>
                 <w:caps w:val="false"/>
                 <w:smallCaps w:val="false"/>
@@ -16691,7 +16623,6 @@
                 <w:b w:val="false"/>
                 <w:bCs w:val="false"/>
                 <w:i w:val="false"/>
-                <w:i w:val="false"/>
                 <w:caps w:val="false"/>
                 <w:smallCaps w:val="false"/>
                 <w:strike w:val="false"/>
@@ -16778,7 +16709,6 @@
                 <w:b w:val="false"/>
                 <w:bCs w:val="false"/>
                 <w:i w:val="false"/>
-                <w:i w:val="false"/>
                 <w:caps w:val="false"/>
                 <w:smallCaps w:val="false"/>
                 <w:strike w:val="false"/>
@@ -16814,7 +16744,7 @@
         </w:tc>
         <w:tc>
           <w:tcPr>
-            <w:tcW w:w="5222" w:type="dxa"/>
+            <w:tcW w:w="5223" w:type="dxa"/>
             <w:tcBorders>
               <w:left w:val="single" w:sz="8" w:space="0" w:color="000000"/>
               <w:bottom w:val="single" w:sz="8" w:space="0" w:color="000000"/>
@@ -16832,7 +16762,6 @@
                 <w:rFonts w:ascii="Arial;sans-serif" w:hAnsi="Arial;sans-serif"/>
                 <w:b w:val="false"/>
                 <w:bCs w:val="false"/>
-                <w:i w:val="false"/>
                 <w:i w:val="false"/>
                 <w:caps w:val="false"/>
                 <w:smallCaps w:val="false"/>
@@ -16890,7 +16819,6 @@
                 <w:b w:val="false"/>
                 <w:bCs w:val="false"/>
                 <w:i w:val="false"/>
-                <w:i w:val="false"/>
                 <w:caps w:val="false"/>
                 <w:smallCaps w:val="false"/>
                 <w:strike w:val="false"/>
@@ -16977,7 +16905,6 @@
                 <w:b w:val="false"/>
                 <w:bCs w:val="false"/>
                 <w:i w:val="false"/>
-                <w:i w:val="false"/>
                 <w:caps w:val="false"/>
                 <w:smallCaps w:val="false"/>
                 <w:strike w:val="false"/>
@@ -17013,7 +16940,7 @@
         </w:tc>
         <w:tc>
           <w:tcPr>
-            <w:tcW w:w="5222" w:type="dxa"/>
+            <w:tcW w:w="5223" w:type="dxa"/>
             <w:tcBorders>
               <w:left w:val="single" w:sz="8" w:space="0" w:color="000000"/>
               <w:bottom w:val="single" w:sz="8" w:space="0" w:color="000000"/>
@@ -17031,7 +16958,6 @@
                 <w:rFonts w:ascii="Arial;sans-serif" w:hAnsi="Arial;sans-serif"/>
                 <w:b w:val="false"/>
                 <w:bCs w:val="false"/>
-                <w:i w:val="false"/>
                 <w:i w:val="false"/>
                 <w:caps w:val="false"/>
                 <w:smallCaps w:val="false"/>
@@ -17089,7 +17015,6 @@
                 <w:b w:val="false"/>
                 <w:bCs w:val="false"/>
                 <w:i w:val="false"/>
-                <w:i w:val="false"/>
                 <w:caps w:val="false"/>
                 <w:smallCaps w:val="false"/>
                 <w:strike w:val="false"/>
@@ -17176,7 +17101,6 @@
                 <w:b w:val="false"/>
                 <w:bCs w:val="false"/>
                 <w:i w:val="false"/>
-                <w:i w:val="false"/>
                 <w:caps w:val="false"/>
                 <w:smallCaps w:val="false"/>
                 <w:strike w:val="false"/>
@@ -17212,7 +17136,7 @@
         </w:tc>
         <w:tc>
           <w:tcPr>
-            <w:tcW w:w="5222" w:type="dxa"/>
+            <w:tcW w:w="5223" w:type="dxa"/>
             <w:tcBorders>
               <w:left w:val="single" w:sz="8" w:space="0" w:color="000000"/>
               <w:bottom w:val="single" w:sz="8" w:space="0" w:color="000000"/>
@@ -17230,7 +17154,6 @@
                 <w:rFonts w:ascii="Arial;sans-serif" w:hAnsi="Arial;sans-serif"/>
                 <w:b w:val="false"/>
                 <w:bCs w:val="false"/>
-                <w:i w:val="false"/>
                 <w:i w:val="false"/>
                 <w:caps w:val="false"/>
                 <w:smallCaps w:val="false"/>
@@ -17288,7 +17211,6 @@
                 <w:b w:val="false"/>
                 <w:bCs w:val="false"/>
                 <w:i w:val="false"/>
-                <w:i w:val="false"/>
                 <w:caps w:val="false"/>
                 <w:smallCaps w:val="false"/>
                 <w:strike w:val="false"/>
@@ -17375,7 +17297,6 @@
                 <w:b w:val="false"/>
                 <w:bCs w:val="false"/>
                 <w:i w:val="false"/>
-                <w:i w:val="false"/>
                 <w:caps w:val="false"/>
                 <w:smallCaps w:val="false"/>
                 <w:strike w:val="false"/>
@@ -17411,7 +17332,7 @@
         </w:tc>
         <w:tc>
           <w:tcPr>
-            <w:tcW w:w="5222" w:type="dxa"/>
+            <w:tcW w:w="5223" w:type="dxa"/>
             <w:tcBorders>
               <w:left w:val="single" w:sz="8" w:space="0" w:color="000000"/>
               <w:bottom w:val="single" w:sz="8" w:space="0" w:color="000000"/>
@@ -17429,7 +17350,6 @@
                 <w:rFonts w:ascii="Arial;sans-serif" w:hAnsi="Arial;sans-serif"/>
                 <w:b w:val="false"/>
                 <w:bCs w:val="false"/>
-                <w:i w:val="false"/>
                 <w:i w:val="false"/>
                 <w:caps w:val="false"/>
                 <w:smallCaps w:val="false"/>
@@ -17487,7 +17407,6 @@
                 <w:b w:val="false"/>
                 <w:bCs w:val="false"/>
                 <w:i w:val="false"/>
-                <w:i w:val="false"/>
                 <w:caps w:val="false"/>
                 <w:smallCaps w:val="false"/>
                 <w:strike w:val="false"/>
@@ -17542,7 +17461,6 @@
                 <w:rFonts w:ascii="Arial;sans-serif" w:hAnsi="Arial;sans-serif"/>
                 <w:b w:val="false"/>
                 <w:bCs w:val="false"/>
-                <w:i w:val="false"/>
                 <w:i w:val="false"/>
                 <w:caps w:val="false"/>
                 <w:smallCaps w:val="false"/>
@@ -17599,7 +17517,6 @@
                 <w:b w:val="false"/>
                 <w:bCs w:val="false"/>
                 <w:i w:val="false"/>
-                <w:i w:val="false"/>
                 <w:caps w:val="false"/>
                 <w:smallCaps w:val="false"/>
                 <w:strike w:val="false"/>
@@ -17635,7 +17552,7 @@
         </w:tc>
         <w:tc>
           <w:tcPr>
-            <w:tcW w:w="5222" w:type="dxa"/>
+            <w:tcW w:w="5223" w:type="dxa"/>
             <w:tcBorders>
               <w:left w:val="single" w:sz="8" w:space="0" w:color="000000"/>
               <w:bottom w:val="single" w:sz="8" w:space="0" w:color="000000"/>
@@ -17653,7 +17570,6 @@
                 <w:rFonts w:ascii="Arial;sans-serif" w:hAnsi="Arial;sans-serif"/>
                 <w:b w:val="false"/>
                 <w:bCs w:val="false"/>
-                <w:i w:val="false"/>
                 <w:i w:val="false"/>
                 <w:caps w:val="false"/>
                 <w:smallCaps w:val="false"/>
@@ -17711,7 +17627,6 @@
                 <w:b w:val="false"/>
                 <w:bCs w:val="false"/>
                 <w:i w:val="false"/>
-                <w:i w:val="false"/>
                 <w:caps w:val="false"/>
                 <w:smallCaps w:val="false"/>
                 <w:strike w:val="false"/>
@@ -17766,7 +17681,6 @@
                 <w:rFonts w:ascii="Arial;sans-serif" w:hAnsi="Arial;sans-serif"/>
                 <w:b w:val="false"/>
                 <w:bCs w:val="false"/>
-                <w:i w:val="false"/>
                 <w:i w:val="false"/>
                 <w:caps w:val="false"/>
                 <w:smallCaps w:val="false"/>
@@ -17823,7 +17737,6 @@
                 <w:b w:val="false"/>
                 <w:bCs w:val="false"/>
                 <w:i w:val="false"/>
-                <w:i w:val="false"/>
                 <w:caps w:val="false"/>
                 <w:smallCaps w:val="false"/>
                 <w:strike w:val="false"/>
@@ -17859,7 +17772,7 @@
         </w:tc>
         <w:tc>
           <w:tcPr>
-            <w:tcW w:w="5222" w:type="dxa"/>
+            <w:tcW w:w="5223" w:type="dxa"/>
             <w:tcBorders>
               <w:left w:val="single" w:sz="8" w:space="0" w:color="000000"/>
               <w:bottom w:val="single" w:sz="8" w:space="0" w:color="000000"/>
@@ -17919,7 +17832,6 @@
                 <w:b w:val="false"/>
                 <w:bCs w:val="false"/>
                 <w:i w:val="false"/>
-                <w:i w:val="false"/>
                 <w:caps w:val="false"/>
                 <w:smallCaps w:val="false"/>
                 <w:strike w:val="false"/>
@@ -17974,7 +17886,6 @@
                 <w:rFonts w:ascii="Arial;sans-serif" w:hAnsi="Arial;sans-serif"/>
                 <w:b w:val="false"/>
                 <w:bCs w:val="false"/>
-                <w:i w:val="false"/>
                 <w:i w:val="false"/>
                 <w:caps w:val="false"/>
                 <w:smallCaps w:val="false"/>
@@ -18031,7 +17942,6 @@
                 <w:b w:val="false"/>
                 <w:bCs w:val="false"/>
                 <w:i w:val="false"/>
-                <w:i w:val="false"/>
                 <w:caps w:val="false"/>
                 <w:smallCaps w:val="false"/>
                 <w:strike w:val="false"/>
@@ -18067,7 +17977,7 @@
         </w:tc>
         <w:tc>
           <w:tcPr>
-            <w:tcW w:w="5222" w:type="dxa"/>
+            <w:tcW w:w="5223" w:type="dxa"/>
             <w:tcBorders>
               <w:left w:val="single" w:sz="8" w:space="0" w:color="000000"/>
               <w:bottom w:val="single" w:sz="8" w:space="0" w:color="000000"/>
@@ -18085,7 +17995,6 @@
                 <w:rFonts w:ascii="Arial;sans-serif" w:hAnsi="Arial;sans-serif"/>
                 <w:b w:val="false"/>
                 <w:bCs w:val="false"/>
-                <w:i w:val="false"/>
                 <w:i w:val="false"/>
                 <w:caps w:val="false"/>
                 <w:smallCaps w:val="false"/>
@@ -18143,7 +18052,6 @@
                 <w:b w:val="false"/>
                 <w:bCs w:val="false"/>
                 <w:i w:val="false"/>
-                <w:i w:val="false"/>
                 <w:caps w:val="false"/>
                 <w:smallCaps w:val="false"/>
                 <w:strike w:val="false"/>
@@ -18198,7 +18106,6 @@
                 <w:rFonts w:ascii="Arial;sans-serif" w:hAnsi="Arial;sans-serif"/>
                 <w:b w:val="false"/>
                 <w:bCs w:val="false"/>
-                <w:i w:val="false"/>
                 <w:i w:val="false"/>
                 <w:caps w:val="false"/>
                 <w:smallCaps w:val="false"/>
@@ -18255,7 +18162,6 @@
                 <w:b w:val="false"/>
                 <w:bCs w:val="false"/>
                 <w:i w:val="false"/>
-                <w:i w:val="false"/>
                 <w:caps w:val="false"/>
                 <w:smallCaps w:val="false"/>
                 <w:strike w:val="false"/>
@@ -18291,7 +18197,7 @@
         </w:tc>
         <w:tc>
           <w:tcPr>
-            <w:tcW w:w="5222" w:type="dxa"/>
+            <w:tcW w:w="5223" w:type="dxa"/>
             <w:tcBorders>
               <w:left w:val="single" w:sz="8" w:space="0" w:color="000000"/>
               <w:bottom w:val="single" w:sz="8" w:space="0" w:color="000000"/>
@@ -18309,7 +18215,6 @@
                 <w:rFonts w:ascii="Arial;sans-serif" w:hAnsi="Arial;sans-serif"/>
                 <w:b w:val="false"/>
                 <w:bCs w:val="false"/>
-                <w:i w:val="false"/>
                 <w:i w:val="false"/>
                 <w:caps w:val="false"/>
                 <w:smallCaps w:val="false"/>
@@ -18367,7 +18272,6 @@
                 <w:b w:val="false"/>
                 <w:bCs w:val="false"/>
                 <w:i w:val="false"/>
-                <w:i w:val="false"/>
                 <w:caps w:val="false"/>
                 <w:smallCaps w:val="false"/>
                 <w:strike w:val="false"/>
@@ -18422,7 +18326,6 @@
                 <w:rFonts w:ascii="Arial;sans-serif" w:hAnsi="Arial;sans-serif"/>
                 <w:b w:val="false"/>
                 <w:bCs w:val="false"/>
-                <w:i w:val="false"/>
                 <w:i w:val="false"/>
                 <w:caps w:val="false"/>
                 <w:smallCaps w:val="false"/>
@@ -18479,7 +18382,6 @@
                 <w:b w:val="false"/>
                 <w:bCs w:val="false"/>
                 <w:i w:val="false"/>
-                <w:i w:val="false"/>
                 <w:caps w:val="false"/>
                 <w:smallCaps w:val="false"/>
                 <w:strike w:val="false"/>
@@ -18515,7 +18417,7 @@
         </w:tc>
         <w:tc>
           <w:tcPr>
-            <w:tcW w:w="5222" w:type="dxa"/>
+            <w:tcW w:w="5223" w:type="dxa"/>
             <w:tcBorders>
               <w:left w:val="single" w:sz="8" w:space="0" w:color="000000"/>
               <w:bottom w:val="single" w:sz="8" w:space="0" w:color="000000"/>
@@ -18533,7 +18435,6 @@
                 <w:rFonts w:ascii="Arial;sans-serif" w:hAnsi="Arial;sans-serif"/>
                 <w:b w:val="false"/>
                 <w:bCs w:val="false"/>
-                <w:i w:val="false"/>
                 <w:i w:val="false"/>
                 <w:caps w:val="false"/>
                 <w:smallCaps w:val="false"/>
@@ -18591,7 +18492,6 @@
                 <w:b w:val="false"/>
                 <w:bCs w:val="false"/>
                 <w:i w:val="false"/>
-                <w:i w:val="false"/>
                 <w:caps w:val="false"/>
                 <w:smallCaps w:val="false"/>
                 <w:strike w:val="false"/>
@@ -18646,7 +18546,6 @@
                 <w:rFonts w:ascii="Arial;sans-serif" w:hAnsi="Arial;sans-serif"/>
                 <w:b w:val="false"/>
                 <w:bCs w:val="false"/>
-                <w:i w:val="false"/>
                 <w:i w:val="false"/>
                 <w:caps w:val="false"/>
                 <w:smallCaps w:val="false"/>
@@ -18703,7 +18602,6 @@
                 <w:b w:val="false"/>
                 <w:bCs w:val="false"/>
                 <w:i w:val="false"/>
-                <w:i w:val="false"/>
                 <w:caps w:val="false"/>
                 <w:smallCaps w:val="false"/>
                 <w:strike w:val="false"/>
@@ -18739,7 +18637,7 @@
         </w:tc>
         <w:tc>
           <w:tcPr>
-            <w:tcW w:w="5222" w:type="dxa"/>
+            <w:tcW w:w="5223" w:type="dxa"/>
             <w:tcBorders>
               <w:left w:val="single" w:sz="8" w:space="0" w:color="000000"/>
               <w:bottom w:val="single" w:sz="8" w:space="0" w:color="000000"/>
@@ -18757,7 +18655,6 @@
                 <w:rFonts w:ascii="Arial;sans-serif" w:hAnsi="Arial;sans-serif"/>
                 <w:b w:val="false"/>
                 <w:bCs w:val="false"/>
-                <w:i w:val="false"/>
                 <w:i w:val="false"/>
                 <w:caps w:val="false"/>
                 <w:smallCaps w:val="false"/>
@@ -18815,7 +18712,6 @@
                 <w:b w:val="false"/>
                 <w:bCs w:val="false"/>
                 <w:i w:val="false"/>
-                <w:i w:val="false"/>
                 <w:caps w:val="false"/>
                 <w:smallCaps w:val="false"/>
                 <w:strike w:val="false"/>
@@ -18870,7 +18766,6 @@
                 <w:rFonts w:ascii="Arial;sans-serif" w:hAnsi="Arial;sans-serif"/>
                 <w:b w:val="false"/>
                 <w:bCs w:val="false"/>
-                <w:i w:val="false"/>
                 <w:i w:val="false"/>
                 <w:caps w:val="false"/>
                 <w:smallCaps w:val="false"/>
@@ -18927,7 +18822,6 @@
                 <w:b w:val="false"/>
                 <w:bCs w:val="false"/>
                 <w:i w:val="false"/>
-                <w:i w:val="false"/>
                 <w:caps w:val="false"/>
                 <w:smallCaps w:val="false"/>
                 <w:strike w:val="false"/>
@@ -18963,7 +18857,7 @@
         </w:tc>
         <w:tc>
           <w:tcPr>
-            <w:tcW w:w="5222" w:type="dxa"/>
+            <w:tcW w:w="5223" w:type="dxa"/>
             <w:tcBorders>
               <w:left w:val="single" w:sz="8" w:space="0" w:color="000000"/>
               <w:bottom w:val="single" w:sz="8" w:space="0" w:color="000000"/>
@@ -18981,7 +18875,6 @@
                 <w:rFonts w:ascii="Arial;sans-serif" w:hAnsi="Arial;sans-serif"/>
                 <w:b w:val="false"/>
                 <w:bCs w:val="false"/>
-                <w:i w:val="false"/>
                 <w:i w:val="false"/>
                 <w:caps w:val="false"/>
                 <w:smallCaps w:val="false"/>
@@ -20288,6 +20181,143 @@
     </w:lvl>
   </w:abstractNum>
   <w:abstractNum w:abstractNumId="10">
+    <w:lvl w:ilvl="0">
+      <w:start w:val="1"/>
+      <w:numFmt w:val="bullet"/>
+      <w:lvlText w:val=""/>
+      <w:lvlJc w:val="left"/>
+      <w:pPr>
+        <w:tabs>
+          <w:tab w:val="num" w:pos="1440"/>
+        </w:tabs>
+        <w:ind w:left="1440" w:hanging="360"/>
+      </w:pPr>
+      <w:rPr>
+        <w:rFonts w:ascii="Symbol" w:hAnsi="Symbol" w:cs="Symbol" w:hint="default"/>
+      </w:rPr>
+    </w:lvl>
+    <w:lvl w:ilvl="1">
+      <w:start w:val="1"/>
+      <w:numFmt w:val="bullet"/>
+      <w:lvlText w:val="◦"/>
+      <w:lvlJc w:val="left"/>
+      <w:pPr>
+        <w:tabs>
+          <w:tab w:val="num" w:pos="1800"/>
+        </w:tabs>
+        <w:ind w:left="1800" w:hanging="360"/>
+      </w:pPr>
+      <w:rPr>
+        <w:rFonts w:ascii="OpenSymbol" w:hAnsi="OpenSymbol" w:cs="OpenSymbol" w:hint="default"/>
+      </w:rPr>
+    </w:lvl>
+    <w:lvl w:ilvl="2">
+      <w:start w:val="1"/>
+      <w:numFmt w:val="bullet"/>
+      <w:lvlText w:val="▪"/>
+      <w:lvlJc w:val="left"/>
+      <w:pPr>
+        <w:tabs>
+          <w:tab w:val="num" w:pos="2160"/>
+        </w:tabs>
+        <w:ind w:left="2160" w:hanging="360"/>
+      </w:pPr>
+      <w:rPr>
+        <w:rFonts w:ascii="OpenSymbol" w:hAnsi="OpenSymbol" w:cs="OpenSymbol" w:hint="default"/>
+      </w:rPr>
+    </w:lvl>
+    <w:lvl w:ilvl="3">
+      <w:start w:val="1"/>
+      <w:numFmt w:val="bullet"/>
+      <w:lvlText w:val=""/>
+      <w:lvlJc w:val="left"/>
+      <w:pPr>
+        <w:tabs>
+          <w:tab w:val="num" w:pos="2520"/>
+        </w:tabs>
+        <w:ind w:left="2520" w:hanging="360"/>
+      </w:pPr>
+      <w:rPr>
+        <w:rFonts w:ascii="Symbol" w:hAnsi="Symbol" w:cs="Symbol" w:hint="default"/>
+      </w:rPr>
+    </w:lvl>
+    <w:lvl w:ilvl="4">
+      <w:start w:val="1"/>
+      <w:numFmt w:val="bullet"/>
+      <w:lvlText w:val="◦"/>
+      <w:lvlJc w:val="left"/>
+      <w:pPr>
+        <w:tabs>
+          <w:tab w:val="num" w:pos="2880"/>
+        </w:tabs>
+        <w:ind w:left="2880" w:hanging="360"/>
+      </w:pPr>
+      <w:rPr>
+        <w:rFonts w:ascii="OpenSymbol" w:hAnsi="OpenSymbol" w:cs="OpenSymbol" w:hint="default"/>
+      </w:rPr>
+    </w:lvl>
+    <w:lvl w:ilvl="5">
+      <w:start w:val="1"/>
+      <w:numFmt w:val="bullet"/>
+      <w:lvlText w:val="▪"/>
+      <w:lvlJc w:val="left"/>
+      <w:pPr>
+        <w:tabs>
+          <w:tab w:val="num" w:pos="3240"/>
+        </w:tabs>
+        <w:ind w:left="3240" w:hanging="360"/>
+      </w:pPr>
+      <w:rPr>
+        <w:rFonts w:ascii="OpenSymbol" w:hAnsi="OpenSymbol" w:cs="OpenSymbol" w:hint="default"/>
+      </w:rPr>
+    </w:lvl>
+    <w:lvl w:ilvl="6">
+      <w:start w:val="1"/>
+      <w:numFmt w:val="bullet"/>
+      <w:lvlText w:val=""/>
+      <w:lvlJc w:val="left"/>
+      <w:pPr>
+        <w:tabs>
+          <w:tab w:val="num" w:pos="3600"/>
+        </w:tabs>
+        <w:ind w:left="3600" w:hanging="360"/>
+      </w:pPr>
+      <w:rPr>
+        <w:rFonts w:ascii="Symbol" w:hAnsi="Symbol" w:cs="Symbol" w:hint="default"/>
+      </w:rPr>
+    </w:lvl>
+    <w:lvl w:ilvl="7">
+      <w:start w:val="1"/>
+      <w:numFmt w:val="bullet"/>
+      <w:lvlText w:val="◦"/>
+      <w:lvlJc w:val="left"/>
+      <w:pPr>
+        <w:tabs>
+          <w:tab w:val="num" w:pos="3960"/>
+        </w:tabs>
+        <w:ind w:left="3960" w:hanging="360"/>
+      </w:pPr>
+      <w:rPr>
+        <w:rFonts w:ascii="OpenSymbol" w:hAnsi="OpenSymbol" w:cs="OpenSymbol" w:hint="default"/>
+      </w:rPr>
+    </w:lvl>
+    <w:lvl w:ilvl="8">
+      <w:start w:val="1"/>
+      <w:numFmt w:val="bullet"/>
+      <w:lvlText w:val="▪"/>
+      <w:lvlJc w:val="left"/>
+      <w:pPr>
+        <w:tabs>
+          <w:tab w:val="num" w:pos="4320"/>
+        </w:tabs>
+        <w:ind w:left="4320" w:hanging="360"/>
+      </w:pPr>
+      <w:rPr>
+        <w:rFonts w:ascii="OpenSymbol" w:hAnsi="OpenSymbol" w:cs="OpenSymbol" w:hint="default"/>
+      </w:rPr>
+    </w:lvl>
+  </w:abstractNum>
+  <w:abstractNum w:abstractNumId="11">
     <w:lvl w:ilvl="0">
       <w:start w:val="1"/>
       <w:numFmt w:val="none"/>
@@ -20435,6 +20465,9 @@
   </w:num>
   <w:num w:numId="10">
     <w:abstractNumId w:val="10"/>
+  </w:num>
+  <w:num w:numId="11">
+    <w:abstractNumId w:val="11"/>
   </w:num>
 </w:numbering>
 </file>
@@ -20855,7 +20888,7 @@
     </w:rPr>
   </w:style>
   <w:style w:type="paragraph" w:styleId="Heading1">
-    <w:name w:val="Heading 1"/>
+    <w:name w:val="heading 1"/>
     <w:basedOn w:val="Normal"/>
     <w:next w:val="Normal"/>
     <w:uiPriority w:val="9"/>
@@ -20872,7 +20905,7 @@
     </w:rPr>
   </w:style>
   <w:style w:type="paragraph" w:styleId="Heading2">
-    <w:name w:val="Heading 2"/>
+    <w:name w:val="heading 2"/>
     <w:basedOn w:val="Normal"/>
     <w:next w:val="Normal"/>
     <w:uiPriority w:val="9"/>
@@ -20890,7 +20923,7 @@
     </w:rPr>
   </w:style>
   <w:style w:type="paragraph" w:styleId="Heading3">
-    <w:name w:val="Heading 3"/>
+    <w:name w:val="heading 3"/>
     <w:basedOn w:val="Normal"/>
     <w:next w:val="Normal"/>
     <w:link w:val="Heading3Char"/>
@@ -20910,7 +20943,7 @@
     </w:rPr>
   </w:style>
   <w:style w:type="paragraph" w:styleId="Heading4">
-    <w:name w:val="Heading 4"/>
+    <w:name w:val="heading 4"/>
     <w:basedOn w:val="Normal"/>
     <w:next w:val="Normal"/>
     <w:uiPriority w:val="9"/>
@@ -20930,7 +20963,7 @@
     </w:rPr>
   </w:style>
   <w:style w:type="paragraph" w:styleId="Heading5">
-    <w:name w:val="Heading 5"/>
+    <w:name w:val="heading 5"/>
     <w:basedOn w:val="Normal"/>
     <w:next w:val="Normal"/>
     <w:uiPriority w:val="9"/>
@@ -20948,7 +20981,7 @@
     </w:rPr>
   </w:style>
   <w:style w:type="paragraph" w:styleId="Heading6">
-    <w:name w:val="Heading 6"/>
+    <w:name w:val="heading 6"/>
     <w:basedOn w:val="Normal"/>
     <w:next w:val="Normal"/>
     <w:uiPriority w:val="9"/>
@@ -21006,8 +21039,8 @@
       <w:szCs w:val="28"/>
     </w:rPr>
   </w:style>
-  <w:style w:type="character" w:styleId="Bullets">
-    <w:name w:val="Bullets"/>
+  <w:style w:type="character" w:styleId="Bulletsuser">
+    <w:name w:val="Bullets (user)"/>
     <w:qFormat/>
     <w:rPr>
       <w:rFonts w:ascii="OpenSymbol" w:hAnsi="OpenSymbol" w:eastAsia="OpenSymbol" w:cs="OpenSymbol"/>
@@ -21025,6 +21058,13 @@
     <w:qFormat/>
     <w:rPr>
       <w:rFonts w:ascii="Liberation Mono" w:hAnsi="Liberation Mono" w:eastAsia="Liberation Mono" w:cs="Liberation Mono"/>
+    </w:rPr>
+  </w:style>
+  <w:style w:type="character" w:styleId="Bullets">
+    <w:name w:val="Bullets"/>
+    <w:qFormat/>
+    <w:rPr>
+      <w:rFonts w:ascii="OpenSymbol" w:hAnsi="OpenSymbol" w:eastAsia="OpenSymbol" w:cs="OpenSymbol"/>
     </w:rPr>
   </w:style>
   <w:style w:type="paragraph" w:styleId="Heading">
@@ -21059,7 +21099,7 @@
     </w:rPr>
   </w:style>
   <w:style w:type="paragraph" w:styleId="Caption">
-    <w:name w:val="Caption"/>
+    <w:name w:val="caption"/>
     <w:basedOn w:val="Normal"/>
     <w:qFormat/>
     <w:pPr>

</xml_diff>